<commit_message>
Feat {Mentor} Done Export math questions
</commit_message>
<xml_diff>
--- a/Thuật toán đề xuất câu hỏi.docx
+++ b/Thuật toán đề xuất câu hỏi.docx
@@ -8,9 +8,11 @@
           <w:lang w:val="vi-VN"/>
         </w:rPr>
       </w:pPr>
+      <w:proofErr w:type="spellStart"/>
       <w:r>
         <w:t>Thuật</w:t>
       </w:r>
+      <w:proofErr w:type="spellEnd"/>
       <w:r>
         <w:rPr>
           <w:lang w:val="vi-VN"/>
@@ -44,34 +46,592 @@
         </w:rPr>
         <w:t xml:space="preserve">: </w:t>
       </w:r>
-      <w:r>
-        <w:t>chương sai nhiều được phân bổ nhiều section/bài nghe/bài đọc hơn; không cần xác định mỗi section lấy bao nhiêu câu vì một section được lấy nguyên bài.</w:t>
-      </w:r>
-    </w:p>
-    <w:p>
-      <w:pPr>
-        <w:rPr>
-          <w:lang w:val="vi-VN"/>
-        </w:rPr>
-      </w:pPr>
-      <w:r>
-        <w:rPr>
-          <w:lang w:val="vi-VN"/>
-        </w:rPr>
-        <w:t>RULE : Số</w:t>
-      </w:r>
-      <w:r>
-        <w:rPr>
-          <w:lang w:val="vi-VN"/>
-        </w:rPr>
-        <w:t xml:space="preserve"> lượng</w:t>
-      </w:r>
-      <w:r>
-        <w:rPr>
-          <w:lang w:val="vi-VN"/>
-        </w:rPr>
-        <w:t xml:space="preserve"> Section xuất hiện trong bài kiểm tra do mentor config phải giữ nguyên</w:t>
-      </w:r>
+      <w:proofErr w:type="spellStart"/>
+      <w:r>
+        <w:t>chương</w:t>
+      </w:r>
+      <w:proofErr w:type="spellEnd"/>
+      <w:r>
+        <w:t xml:space="preserve"> </w:t>
+      </w:r>
+      <w:proofErr w:type="spellStart"/>
+      <w:r>
+        <w:t>sai</w:t>
+      </w:r>
+      <w:proofErr w:type="spellEnd"/>
+      <w:r>
+        <w:t xml:space="preserve"> </w:t>
+      </w:r>
+      <w:proofErr w:type="spellStart"/>
+      <w:r>
+        <w:t>nhiều</w:t>
+      </w:r>
+      <w:proofErr w:type="spellEnd"/>
+      <w:r>
+        <w:t xml:space="preserve"> </w:t>
+      </w:r>
+      <w:proofErr w:type="spellStart"/>
+      <w:r>
+        <w:t>được</w:t>
+      </w:r>
+      <w:proofErr w:type="spellEnd"/>
+      <w:r>
+        <w:t xml:space="preserve"> </w:t>
+      </w:r>
+      <w:proofErr w:type="spellStart"/>
+      <w:r>
+        <w:t>phân</w:t>
+      </w:r>
+      <w:proofErr w:type="spellEnd"/>
+      <w:r>
+        <w:t xml:space="preserve"> </w:t>
+      </w:r>
+      <w:proofErr w:type="spellStart"/>
+      <w:r>
+        <w:t>bổ</w:t>
+      </w:r>
+      <w:proofErr w:type="spellEnd"/>
+      <w:r>
+        <w:t xml:space="preserve"> </w:t>
+      </w:r>
+      <w:proofErr w:type="spellStart"/>
+      <w:r>
+        <w:t>nhiều</w:t>
+      </w:r>
+      <w:proofErr w:type="spellEnd"/>
+      <w:r>
+        <w:t> section/</w:t>
+      </w:r>
+      <w:proofErr w:type="spellStart"/>
+      <w:r>
+        <w:t>bài</w:t>
+      </w:r>
+      <w:proofErr w:type="spellEnd"/>
+      <w:r>
+        <w:t xml:space="preserve"> </w:t>
+      </w:r>
+      <w:proofErr w:type="spellStart"/>
+      <w:r>
+        <w:t>nghe</w:t>
+      </w:r>
+      <w:proofErr w:type="spellEnd"/>
+      <w:r>
+        <w:t>/</w:t>
+      </w:r>
+      <w:proofErr w:type="spellStart"/>
+      <w:r>
+        <w:t>bài</w:t>
+      </w:r>
+      <w:proofErr w:type="spellEnd"/>
+      <w:r>
+        <w:t xml:space="preserve"> </w:t>
+      </w:r>
+      <w:proofErr w:type="spellStart"/>
+      <w:r>
+        <w:t>đọc</w:t>
+      </w:r>
+      <w:proofErr w:type="spellEnd"/>
+      <w:r>
+        <w:t> </w:t>
+      </w:r>
+      <w:proofErr w:type="spellStart"/>
+      <w:r>
+        <w:t>hơn</w:t>
+      </w:r>
+      <w:proofErr w:type="spellEnd"/>
+      <w:r>
+        <w:t xml:space="preserve">; </w:t>
+      </w:r>
+      <w:proofErr w:type="spellStart"/>
+      <w:r>
+        <w:t>không</w:t>
+      </w:r>
+      <w:proofErr w:type="spellEnd"/>
+      <w:r>
+        <w:t xml:space="preserve"> </w:t>
+      </w:r>
+      <w:proofErr w:type="spellStart"/>
+      <w:r>
+        <w:t>cần</w:t>
+      </w:r>
+      <w:proofErr w:type="spellEnd"/>
+      <w:r>
+        <w:t xml:space="preserve"> </w:t>
+      </w:r>
+      <w:proofErr w:type="spellStart"/>
+      <w:r>
+        <w:t>xác</w:t>
+      </w:r>
+      <w:proofErr w:type="spellEnd"/>
+      <w:r>
+        <w:t xml:space="preserve"> </w:t>
+      </w:r>
+      <w:proofErr w:type="spellStart"/>
+      <w:r>
+        <w:t>định</w:t>
+      </w:r>
+      <w:proofErr w:type="spellEnd"/>
+      <w:r>
+        <w:t xml:space="preserve"> </w:t>
+      </w:r>
+      <w:proofErr w:type="spellStart"/>
+      <w:r>
+        <w:t>mỗi</w:t>
+      </w:r>
+      <w:proofErr w:type="spellEnd"/>
+      <w:r>
+        <w:t xml:space="preserve"> section </w:t>
+      </w:r>
+      <w:proofErr w:type="spellStart"/>
+      <w:r>
+        <w:t>lấy</w:t>
+      </w:r>
+      <w:proofErr w:type="spellEnd"/>
+      <w:r>
+        <w:t xml:space="preserve"> bao </w:t>
+      </w:r>
+      <w:proofErr w:type="spellStart"/>
+      <w:r>
+        <w:t>nhiêu</w:t>
+      </w:r>
+      <w:proofErr w:type="spellEnd"/>
+      <w:r>
+        <w:t xml:space="preserve"> </w:t>
+      </w:r>
+      <w:proofErr w:type="spellStart"/>
+      <w:r>
+        <w:t>câu</w:t>
+      </w:r>
+      <w:proofErr w:type="spellEnd"/>
+      <w:r>
+        <w:t xml:space="preserve"> </w:t>
+      </w:r>
+      <w:proofErr w:type="spellStart"/>
+      <w:r>
+        <w:t>vì</w:t>
+      </w:r>
+      <w:proofErr w:type="spellEnd"/>
+      <w:r>
+        <w:t xml:space="preserve"> </w:t>
+      </w:r>
+      <w:proofErr w:type="spellStart"/>
+      <w:r>
+        <w:t>một</w:t>
+      </w:r>
+      <w:proofErr w:type="spellEnd"/>
+      <w:r>
+        <w:t xml:space="preserve"> section </w:t>
+      </w:r>
+      <w:proofErr w:type="spellStart"/>
+      <w:r>
+        <w:t>được</w:t>
+      </w:r>
+      <w:proofErr w:type="spellEnd"/>
+      <w:r>
+        <w:t xml:space="preserve"> </w:t>
+      </w:r>
+      <w:proofErr w:type="spellStart"/>
+      <w:r>
+        <w:t>lấy</w:t>
+      </w:r>
+      <w:proofErr w:type="spellEnd"/>
+      <w:r>
+        <w:t xml:space="preserve"> </w:t>
+      </w:r>
+      <w:proofErr w:type="spellStart"/>
+      <w:r>
+        <w:t>nguyên</w:t>
+      </w:r>
+      <w:proofErr w:type="spellEnd"/>
+      <w:r>
+        <w:t xml:space="preserve"> </w:t>
+      </w:r>
+      <w:proofErr w:type="spellStart"/>
+      <w:r>
+        <w:t>bài</w:t>
+      </w:r>
+      <w:proofErr w:type="spellEnd"/>
+      <w:r>
+        <w:t>.</w:t>
+      </w:r>
+    </w:p>
+    <w:p>
+      <w:pPr>
+        <w:rPr>
+          <w:lang w:val="vi-VN"/>
+        </w:rPr>
+      </w:pPr>
+      <w:r>
+        <w:rPr>
+          <w:lang w:val="vi-VN"/>
+        </w:rPr>
+        <w:t xml:space="preserve">RULE : </w:t>
+      </w:r>
+    </w:p>
+    <w:p>
+      <w:pPr>
+        <w:pStyle w:val="ListParagraph"/>
+        <w:numPr>
+          <w:ilvl w:val="0"/>
+          <w:numId w:val="5"/>
+        </w:numPr>
+        <w:rPr>
+          <w:lang w:val="vi-VN"/>
+        </w:rPr>
+      </w:pPr>
+      <w:r>
+        <w:rPr>
+          <w:lang w:val="vi-VN"/>
+        </w:rPr>
+        <w:t>T</w:t>
+      </w:r>
+      <w:proofErr w:type="spellStart"/>
+      <w:r>
+        <w:t>ổng</w:t>
+      </w:r>
+      <w:proofErr w:type="spellEnd"/>
+      <w:r>
+        <w:t xml:space="preserve"> section </w:t>
+      </w:r>
+      <w:proofErr w:type="spellStart"/>
+      <w:r>
+        <w:t>sau</w:t>
+      </w:r>
+      <w:proofErr w:type="spellEnd"/>
+      <w:r>
+        <w:t xml:space="preserve"> </w:t>
+      </w:r>
+      <w:proofErr w:type="spellStart"/>
+      <w:r>
+        <w:t>đề</w:t>
+      </w:r>
+      <w:proofErr w:type="spellEnd"/>
+      <w:r>
+        <w:t xml:space="preserve"> </w:t>
+      </w:r>
+      <w:proofErr w:type="spellStart"/>
+      <w:r>
+        <w:t>xuất</w:t>
+      </w:r>
+      <w:proofErr w:type="spellEnd"/>
+      <w:r>
+        <w:t xml:space="preserve"> </w:t>
+      </w:r>
+      <w:r>
+        <w:rPr>
+          <w:lang w:val="vi-VN"/>
+        </w:rPr>
+        <w:t>&lt;=</w:t>
+      </w:r>
+      <w:r>
+        <w:t xml:space="preserve"> </w:t>
+      </w:r>
+      <w:proofErr w:type="spellStart"/>
+      <w:r>
+        <w:t>tổng</w:t>
+      </w:r>
+      <w:proofErr w:type="spellEnd"/>
+      <w:r>
+        <w:rPr>
+          <w:lang w:val="vi-VN"/>
+        </w:rPr>
+        <w:t xml:space="preserve"> section do</w:t>
+      </w:r>
+      <w:r>
+        <w:t xml:space="preserve"> mentor</w:t>
+      </w:r>
+    </w:p>
+    <w:p>
+      <w:pPr>
+        <w:numPr>
+          <w:ilvl w:val="0"/>
+          <w:numId w:val="5"/>
+        </w:numPr>
+      </w:pPr>
+      <w:proofErr w:type="spellStart"/>
+      <w:r>
+        <w:t>Chương</w:t>
+      </w:r>
+      <w:proofErr w:type="spellEnd"/>
+      <w:r>
+        <w:t xml:space="preserve"> </w:t>
+      </w:r>
+      <w:proofErr w:type="spellStart"/>
+      <w:r>
+        <w:t>thiếu</w:t>
+      </w:r>
+      <w:proofErr w:type="spellEnd"/>
+      <w:r>
+        <w:t xml:space="preserve"> section </w:t>
+      </w:r>
+      <w:proofErr w:type="spellStart"/>
+      <w:r>
+        <w:t>trong</w:t>
+      </w:r>
+      <w:proofErr w:type="spellEnd"/>
+      <w:r>
+        <w:t xml:space="preserve"> bank → </w:t>
+      </w:r>
+      <w:proofErr w:type="spellStart"/>
+      <w:r>
+        <w:t>lấy</w:t>
+      </w:r>
+      <w:proofErr w:type="spellEnd"/>
+      <w:r>
+        <w:t xml:space="preserve"> </w:t>
+      </w:r>
+      <w:proofErr w:type="spellStart"/>
+      <w:r>
+        <w:t>hết</w:t>
+      </w:r>
+      <w:proofErr w:type="spellEnd"/>
+      <w:r>
+        <w:t xml:space="preserve"> section </w:t>
+      </w:r>
+      <w:proofErr w:type="spellStart"/>
+      <w:r>
+        <w:t>chương</w:t>
+      </w:r>
+      <w:proofErr w:type="spellEnd"/>
+      <w:r>
+        <w:t xml:space="preserve"> </w:t>
+      </w:r>
+      <w:proofErr w:type="spellStart"/>
+      <w:r>
+        <w:t>đó</w:t>
+      </w:r>
+      <w:proofErr w:type="spellEnd"/>
+    </w:p>
+    <w:p>
+      <w:pPr>
+        <w:numPr>
+          <w:ilvl w:val="0"/>
+          <w:numId w:val="5"/>
+        </w:numPr>
+      </w:pPr>
+      <w:proofErr w:type="spellStart"/>
+      <w:r>
+        <w:t>Bù</w:t>
+      </w:r>
+      <w:proofErr w:type="spellEnd"/>
+      <w:r>
+        <w:t xml:space="preserve"> </w:t>
+      </w:r>
+      <w:proofErr w:type="spellStart"/>
+      <w:r>
+        <w:t>phần</w:t>
+      </w:r>
+      <w:proofErr w:type="spellEnd"/>
+      <w:r>
+        <w:t xml:space="preserve"> </w:t>
+      </w:r>
+      <w:proofErr w:type="spellStart"/>
+      <w:r>
+        <w:t>thiếu</w:t>
+      </w:r>
+      <w:proofErr w:type="spellEnd"/>
+      <w:r>
+        <w:t xml:space="preserve"> sang </w:t>
+      </w:r>
+      <w:proofErr w:type="spellStart"/>
+      <w:r>
+        <w:t>chương</w:t>
+      </w:r>
+      <w:proofErr w:type="spellEnd"/>
+      <w:r>
+        <w:t xml:space="preserve"> </w:t>
+      </w:r>
+      <w:proofErr w:type="spellStart"/>
+      <w:r>
+        <w:t>khác</w:t>
+      </w:r>
+      <w:proofErr w:type="spellEnd"/>
+      <w:r>
+        <w:t xml:space="preserve"> </w:t>
+      </w:r>
+      <w:proofErr w:type="spellStart"/>
+      <w:r>
+        <w:t>theo</w:t>
+      </w:r>
+      <w:proofErr w:type="spellEnd"/>
+      <w:r>
+        <w:t xml:space="preserve"> weight </w:t>
+      </w:r>
+      <w:proofErr w:type="spellStart"/>
+      <w:r>
+        <w:t>cao</w:t>
+      </w:r>
+      <w:proofErr w:type="spellEnd"/>
+      <w:r>
+        <w:t xml:space="preserve"> → </w:t>
+      </w:r>
+      <w:proofErr w:type="spellStart"/>
+      <w:r>
+        <w:t>thấp</w:t>
+      </w:r>
+      <w:proofErr w:type="spellEnd"/>
+    </w:p>
+    <w:p>
+      <w:pPr>
+        <w:numPr>
+          <w:ilvl w:val="0"/>
+          <w:numId w:val="5"/>
+        </w:numPr>
+      </w:pPr>
+      <w:r>
+        <w:t xml:space="preserve">Random </w:t>
+      </w:r>
+      <w:proofErr w:type="spellStart"/>
+      <w:r>
+        <w:t>nếu</w:t>
+      </w:r>
+      <w:proofErr w:type="spellEnd"/>
+      <w:r>
+        <w:t xml:space="preserve"> </w:t>
+      </w:r>
+      <w:proofErr w:type="spellStart"/>
+      <w:r>
+        <w:t>đủ</w:t>
+      </w:r>
+      <w:proofErr w:type="spellEnd"/>
+      <w:r>
+        <w:t xml:space="preserve"> section </w:t>
+      </w:r>
+      <w:proofErr w:type="spellStart"/>
+      <w:r>
+        <w:t>trong</w:t>
+      </w:r>
+      <w:proofErr w:type="spellEnd"/>
+      <w:r>
+        <w:t xml:space="preserve"> bank</w:t>
+      </w:r>
+    </w:p>
+    <w:p>
+      <w:pPr>
+        <w:numPr>
+          <w:ilvl w:val="0"/>
+          <w:numId w:val="5"/>
+        </w:numPr>
+      </w:pPr>
+      <w:proofErr w:type="spellStart"/>
+      <w:r>
+        <w:t>Hết</w:t>
+      </w:r>
+      <w:proofErr w:type="spellEnd"/>
+      <w:r>
+        <w:t xml:space="preserve"> bank → </w:t>
+      </w:r>
+      <w:proofErr w:type="spellStart"/>
+      <w:r>
+        <w:t>dừng</w:t>
+      </w:r>
+      <w:proofErr w:type="spellEnd"/>
+      <w:r>
+        <w:t xml:space="preserve"> </w:t>
+      </w:r>
+      <w:proofErr w:type="spellStart"/>
+      <w:r>
+        <w:t>bù</w:t>
+      </w:r>
+      <w:proofErr w:type="spellEnd"/>
+      <w:r>
+        <w:t xml:space="preserve">, </w:t>
+      </w:r>
+      <w:proofErr w:type="spellStart"/>
+      <w:r>
+        <w:t>tổng</w:t>
+      </w:r>
+      <w:proofErr w:type="spellEnd"/>
+      <w:r>
+        <w:t> ≤ mentor</w:t>
+      </w:r>
+    </w:p>
+    <w:p>
+      <w:pPr>
+        <w:numPr>
+          <w:ilvl w:val="0"/>
+          <w:numId w:val="5"/>
+        </w:numPr>
+      </w:pPr>
+      <w:proofErr w:type="spellStart"/>
+      <w:r>
+        <w:t>Chương</w:t>
+      </w:r>
+      <w:proofErr w:type="spellEnd"/>
+      <w:r>
+        <w:t xml:space="preserve"> </w:t>
+      </w:r>
+      <w:proofErr w:type="spellStart"/>
+      <w:r>
+        <w:t>có</w:t>
+      </w:r>
+      <w:proofErr w:type="spellEnd"/>
+      <w:r>
+        <w:t xml:space="preserve"> weight = 0 → </w:t>
+      </w:r>
+      <w:proofErr w:type="spellStart"/>
+      <w:r>
+        <w:t>không</w:t>
+      </w:r>
+      <w:proofErr w:type="spellEnd"/>
+      <w:r>
+        <w:t xml:space="preserve"> </w:t>
+      </w:r>
+      <w:proofErr w:type="spellStart"/>
+      <w:r>
+        <w:t>xuất</w:t>
+      </w:r>
+      <w:proofErr w:type="spellEnd"/>
+      <w:r>
+        <w:t xml:space="preserve"> </w:t>
+      </w:r>
+      <w:proofErr w:type="spellStart"/>
+      <w:r>
+        <w:t>hiện</w:t>
+      </w:r>
+      <w:proofErr w:type="spellEnd"/>
+      <w:r>
+        <w:t xml:space="preserve"> (</w:t>
+      </w:r>
+      <w:proofErr w:type="spellStart"/>
+      <w:r>
+        <w:t>xem</w:t>
+      </w:r>
+      <w:proofErr w:type="spellEnd"/>
+      <w:r>
+        <w:t xml:space="preserve"> Trường </w:t>
+      </w:r>
+      <w:proofErr w:type="spellStart"/>
+      <w:r>
+        <w:t>hợp</w:t>
+      </w:r>
+      <w:proofErr w:type="spellEnd"/>
+      <w:r>
+        <w:t xml:space="preserve"> 3 </w:t>
+      </w:r>
+      <w:proofErr w:type="spellStart"/>
+      <w:r>
+        <w:t>bên</w:t>
+      </w:r>
+      <w:proofErr w:type="spellEnd"/>
+      <w:r>
+        <w:t xml:space="preserve"> </w:t>
+      </w:r>
+      <w:proofErr w:type="spellStart"/>
+      <w:r>
+        <w:t>dưới</w:t>
+      </w:r>
+      <w:proofErr w:type="spellEnd"/>
+      <w:r>
+        <w:t>).</w:t>
+      </w:r>
+    </w:p>
+    <w:p>
+      <w:pPr>
+        <w:rPr>
+          <w:lang w:val="vi-VN"/>
+        </w:rPr>
+      </w:pPr>
     </w:p>
     <w:p>
       <w:pPr>
@@ -142,7 +702,143 @@
         <w:rPr>
           <w:lang w:val="vi-VN"/>
         </w:rPr>
-        <w:t xml:space="preserve">=&gt; Kết quả được làm tròn tới số gần nhất </w:t>
+        <w:t xml:space="preserve">=&gt; </w:t>
+      </w:r>
+      <w:proofErr w:type="spellStart"/>
+      <w:r>
+        <w:t>Làm</w:t>
+      </w:r>
+      <w:proofErr w:type="spellEnd"/>
+      <w:r>
+        <w:t xml:space="preserve"> </w:t>
+      </w:r>
+      <w:proofErr w:type="spellStart"/>
+      <w:r>
+        <w:t>tròn</w:t>
+      </w:r>
+      <w:proofErr w:type="spellEnd"/>
+      <w:r>
+        <w:t> </w:t>
+      </w:r>
+      <w:proofErr w:type="spellStart"/>
+      <w:r>
+        <w:t>xuống</w:t>
+      </w:r>
+      <w:proofErr w:type="spellEnd"/>
+      <w:r>
+        <w:t xml:space="preserve"> (floor). </w:t>
+      </w:r>
+      <w:proofErr w:type="spellStart"/>
+      <w:r>
+        <w:t>Phần</w:t>
+      </w:r>
+      <w:proofErr w:type="spellEnd"/>
+      <w:r>
+        <w:t xml:space="preserve"> section </w:t>
+      </w:r>
+      <w:proofErr w:type="spellStart"/>
+      <w:r>
+        <w:t>còn</w:t>
+      </w:r>
+      <w:proofErr w:type="spellEnd"/>
+      <w:r>
+        <w:t xml:space="preserve"> </w:t>
+      </w:r>
+      <w:proofErr w:type="spellStart"/>
+      <w:r>
+        <w:t>thiếu</w:t>
+      </w:r>
+      <w:proofErr w:type="spellEnd"/>
+      <w:r>
+        <w:t> </w:t>
+      </w:r>
+      <w:proofErr w:type="spellStart"/>
+      <w:r>
+        <w:t>bù</w:t>
+      </w:r>
+      <w:proofErr w:type="spellEnd"/>
+      <w:r>
+        <w:t xml:space="preserve"> </w:t>
+      </w:r>
+      <w:proofErr w:type="spellStart"/>
+      <w:r>
+        <w:t>vào</w:t>
+      </w:r>
+      <w:proofErr w:type="spellEnd"/>
+      <w:r>
+        <w:t xml:space="preserve"> </w:t>
+      </w:r>
+      <w:proofErr w:type="spellStart"/>
+      <w:r>
+        <w:t>chương</w:t>
+      </w:r>
+      <w:proofErr w:type="spellEnd"/>
+      <w:r>
+        <w:t xml:space="preserve"> </w:t>
+      </w:r>
+      <w:proofErr w:type="spellStart"/>
+      <w:r>
+        <w:t>có</w:t>
+      </w:r>
+      <w:proofErr w:type="spellEnd"/>
+      <w:r>
+        <w:t xml:space="preserve"> weight </w:t>
+      </w:r>
+      <w:proofErr w:type="spellStart"/>
+      <w:r>
+        <w:t>lớn</w:t>
+      </w:r>
+      <w:proofErr w:type="spellEnd"/>
+      <w:r>
+        <w:t xml:space="preserve"> </w:t>
+      </w:r>
+      <w:proofErr w:type="spellStart"/>
+      <w:r>
+        <w:t>nhất</w:t>
+      </w:r>
+      <w:proofErr w:type="spellEnd"/>
+      <w:r>
+        <w:t> (</w:t>
+      </w:r>
+      <w:proofErr w:type="spellStart"/>
+      <w:r>
+        <w:t>giống</w:t>
+      </w:r>
+      <w:proofErr w:type="spellEnd"/>
+      <w:r>
+        <w:t xml:space="preserve"> </w:t>
+      </w:r>
+      <w:proofErr w:type="spellStart"/>
+      <w:r>
+        <w:t>ví</w:t>
+      </w:r>
+      <w:proofErr w:type="spellEnd"/>
+      <w:r>
+        <w:t xml:space="preserve"> </w:t>
+      </w:r>
+      <w:proofErr w:type="spellStart"/>
+      <w:r>
+        <w:t>dụ</w:t>
+      </w:r>
+      <w:proofErr w:type="spellEnd"/>
+      <w:r>
+        <w:t xml:space="preserve"> Case 2 </w:t>
+      </w:r>
+      <w:proofErr w:type="spellStart"/>
+      <w:r>
+        <w:t>bên</w:t>
+      </w:r>
+      <w:proofErr w:type="spellEnd"/>
+      <w:r>
+        <w:t xml:space="preserve"> </w:t>
+      </w:r>
+      <w:proofErr w:type="spellStart"/>
+      <w:r>
+        <w:t>dưới</w:t>
+      </w:r>
+      <w:proofErr w:type="spellEnd"/>
+      <w:r>
+        <w:t>)</w:t>
       </w:r>
     </w:p>
     <w:p>
@@ -168,8 +864,10 @@
       </w:pPr>
       <w:r>
         <w:rPr>
-          <w:lang w:val="vi-VN"/>
-        </w:rPr>
+          <w:noProof/>
+          <w:lang w:val="vi-VN"/>
+        </w:rPr>
+        <w:lastRenderedPageBreak/>
         <w:drawing>
           <wp:inline distT="0" distB="0" distL="0" distR="0" wp14:anchorId="489E593C" wp14:editId="4D1971EE">
             <wp:extent cx="5943600" cy="3042920"/>
@@ -289,9 +987,11 @@
       </w:pPr>
       <w:r>
         <w:rPr>
+          <w:noProof/>
           <w:color w:val="EE0000"/>
           <w:lang w:val="vi-VN"/>
         </w:rPr>
+        <w:lastRenderedPageBreak/>
         <w:drawing>
           <wp:inline distT="0" distB="0" distL="0" distR="0" wp14:anchorId="25A52D6E" wp14:editId="769C04AC">
             <wp:extent cx="5943600" cy="3053080"/>
@@ -560,25 +1260,7 @@
         <w:rPr>
           <w:lang w:val="vi-VN"/>
         </w:rPr>
-        <w:t xml:space="preserve">Section chương </w:t>
-      </w:r>
-      <w:r>
-        <w:rPr>
-          <w:lang w:val="vi-VN"/>
-        </w:rPr>
-        <w:t>2</w:t>
-      </w:r>
-      <w:r>
-        <w:rPr>
-          <w:lang w:val="vi-VN"/>
-        </w:rPr>
-        <w:t xml:space="preserve"> =  0.</w:t>
-      </w:r>
-      <w:r>
-        <w:rPr>
-          <w:lang w:val="vi-VN"/>
-        </w:rPr>
-        <w:t>7</w:t>
+        <w:t>Section chương 2 =  0.7</w:t>
       </w:r>
       <w:r>
         <w:rPr>
@@ -610,19 +1292,7 @@
         <w:rPr>
           <w:lang w:val="vi-VN"/>
         </w:rPr>
-        <w:t xml:space="preserve">Section chương </w:t>
-      </w:r>
-      <w:r>
-        <w:rPr>
-          <w:lang w:val="vi-VN"/>
-        </w:rPr>
-        <w:t>3</w:t>
-      </w:r>
-      <w:r>
-        <w:rPr>
-          <w:lang w:val="vi-VN"/>
-        </w:rPr>
-        <w:t xml:space="preserve"> = </w:t>
+        <w:t xml:space="preserve">Section chương 3 = </w:t>
       </w:r>
       <w:r>
         <w:rPr>
@@ -696,13 +1366,7 @@
         <w:rPr>
           <w:lang w:val="vi-VN"/>
         </w:rPr>
-        <w:t xml:space="preserve">Kết quả cuối cùng : </w:t>
-      </w:r>
-      <w:r>
-        <w:rPr>
-          <w:lang w:val="vi-VN"/>
-        </w:rPr>
-        <w:t>Section chương 1 =  0.35 / 1.65 * 5 = ~ 1.06 = 1</w:t>
+        <w:t>Kết quả cuối cùng : Section chương 1 =  0.35 / 1.65 * 5 = ~ 1.06 = 1</w:t>
       </w:r>
     </w:p>
     <w:p>
@@ -742,19 +1406,7 @@
         <w:rPr>
           <w:lang w:val="vi-VN"/>
         </w:rPr>
-        <w:t xml:space="preserve">           </w:t>
-      </w:r>
-      <w:r>
-        <w:rPr>
-          <w:lang w:val="vi-VN"/>
-        </w:rPr>
-        <w:t xml:space="preserve">Section chương 3 = 0.6 / 1.65 * 5 = ~ 1,81 = </w:t>
-      </w:r>
-      <w:r>
-        <w:rPr>
-          <w:lang w:val="vi-VN"/>
-        </w:rPr>
-        <w:t>1</w:t>
+        <w:t xml:space="preserve">           Section chương 3 = 0.6 / 1.65 * 5 = ~ 1,81 = 1</w:t>
       </w:r>
     </w:p>
     <w:p>
@@ -774,13 +1426,12 @@
         </w:rPr>
         <w:t>Tổng Section sau khi áp dụng thuật toán = Tổng Section do mentor config</w:t>
       </w:r>
-    </w:p>
-    <w:p>
-      <w:pPr>
-        <w:rPr>
-          <w:lang w:val="vi-VN"/>
-        </w:rPr>
-      </w:pPr>
+      <w:r>
+        <w:rPr>
+          <w:lang w:val="vi-VN"/>
+        </w:rPr>
+        <w:br/>
+      </w:r>
     </w:p>
     <w:p>
       <w:pPr>
@@ -793,47 +1444,59 @@
           <w:color w:val="EE0000"/>
           <w:lang w:val="vi-VN"/>
         </w:rPr>
+        <w:t>Trường hợp 3</w:t>
+      </w:r>
+      <w:r>
+        <w:rPr>
+          <w:lang w:val="vi-VN"/>
+        </w:rPr>
+        <w:t>: Có 1 chương bất kỳ có Weight = 0</w:t>
+      </w:r>
+    </w:p>
+    <w:p>
+      <w:pPr>
+        <w:rPr>
+          <w:lang w:val="vi-VN"/>
+        </w:rPr>
+      </w:pPr>
+      <w:r>
+        <w:rPr>
+          <w:lang w:val="vi-VN"/>
+        </w:rPr>
+        <w:t>=&gt;&gt; Lần làm lại test tiếp theo sẽ không xuất hiện chương đó</w:t>
+      </w:r>
+    </w:p>
+    <w:p>
+      <w:pPr>
+        <w:rPr>
+          <w:lang w:val="vi-VN"/>
+        </w:rPr>
+      </w:pPr>
+      <w:r>
+        <w:rPr>
+          <w:color w:val="EE0000"/>
+          <w:lang w:val="vi-VN"/>
+        </w:rPr>
         <w:lastRenderedPageBreak/>
-        <w:t>Trường hợp 3</w:t>
-      </w:r>
-      <w:r>
-        <w:rPr>
-          <w:lang w:val="vi-VN"/>
-        </w:rPr>
-        <w:t>: Có 1 chương bất kỳ có Weight = 0</w:t>
-      </w:r>
-    </w:p>
-    <w:p>
-      <w:pPr>
-        <w:rPr>
-          <w:lang w:val="vi-VN"/>
-        </w:rPr>
-      </w:pPr>
-      <w:r>
-        <w:rPr>
-          <w:lang w:val="vi-VN"/>
-        </w:rPr>
-        <w:t>=&gt;&gt; Lần làm lại test tiếp theo sẽ không xuất hiện chương đó</w:t>
-      </w:r>
-    </w:p>
-    <w:p>
-      <w:pPr>
-        <w:rPr>
-          <w:lang w:val="vi-VN"/>
-        </w:rPr>
-      </w:pPr>
-      <w:r>
-        <w:rPr>
-          <w:color w:val="EE0000"/>
-          <w:lang w:val="vi-VN"/>
-        </w:rPr>
         <w:t xml:space="preserve">Trường hợp Exception : </w:t>
       </w:r>
       <w:r>
         <w:rPr>
           <w:lang w:val="vi-VN"/>
         </w:rPr>
-        <w:t>Sau nhiều vòng làm sẽ dẫn tới 1 trường hợp đó là các chương có tỷ lệ Weight = 0 sẽ dần biết mất, sau nhiều vòng làm sẽ chỉ còn lại DUY NHẤT các Section của 1 chương cụ thể</w:t>
+        <w:t xml:space="preserve">Sau nhiều vòng làm sẽ dẫn tới 1 trường hợp đó là các chương có tỷ lệ Weight = 0 sẽ </w:t>
+      </w:r>
+      <w:r>
+        <w:rPr>
+          <w:lang w:val="vi-VN"/>
+        </w:rPr>
+        <w:t xml:space="preserve">biến </w:t>
+      </w:r>
+      <w:r>
+        <w:rPr>
+          <w:lang w:val="vi-VN"/>
+        </w:rPr>
+        <w:t>mất, sau nhiều vòng làm sẽ chỉ còn lại DUY NHẤT các Section của 1 chương cụ thể</w:t>
       </w:r>
     </w:p>
     <w:p>
@@ -909,16 +1572,29 @@
     </w:p>
     <w:p>
       <w:pPr>
-        <w:rPr>
-          <w:lang w:val="vi-VN"/>
-        </w:rPr>
-      </w:pPr>
-      <w:r>
-        <w:rPr>
-          <w:lang w:val="vi-VN"/>
-        </w:rPr>
-        <w:t xml:space="preserve">RULE : </w:t>
-      </w:r>
+        <w:ind w:left="360"/>
+        <w:rPr>
+          <w:lang w:val="vi-VN"/>
+        </w:rPr>
+      </w:pPr>
+      <w:r>
+        <w:rPr>
+          <w:lang w:val="vi-VN"/>
+        </w:rPr>
+        <w:t>RULE :</w:t>
+      </w:r>
+    </w:p>
+    <w:p>
+      <w:pPr>
+        <w:pStyle w:val="ListParagraph"/>
+        <w:numPr>
+          <w:ilvl w:val="1"/>
+          <w:numId w:val="8"/>
+        </w:numPr>
+        <w:rPr>
+          <w:lang w:val="vi-VN"/>
+        </w:rPr>
+      </w:pPr>
       <w:r>
         <w:rPr>
           <w:lang w:val="vi-VN"/>
@@ -929,25 +1605,517 @@
         <w:rPr>
           <w:lang w:val="vi-VN"/>
         </w:rPr>
-        <w:t xml:space="preserve">Số </w:t>
-      </w:r>
-      <w:r>
-        <w:rPr>
-          <w:lang w:val="vi-VN"/>
-        </w:rPr>
-        <w:t xml:space="preserve">câu hỏi </w:t>
-      </w:r>
-      <w:r>
-        <w:rPr>
-          <w:lang w:val="vi-VN"/>
-        </w:rPr>
-        <w:t xml:space="preserve">xuất hiện trong bài kiểm tra do mentor config phải giữ </w:t>
-      </w:r>
-      <w:r>
-        <w:rPr>
-          <w:lang w:val="vi-VN"/>
-        </w:rPr>
-        <w:t>nguyên.</w:t>
+        <w:t>Số</w:t>
+      </w:r>
+      <w:r>
+        <w:rPr>
+          <w:lang w:val="vi-VN"/>
+        </w:rPr>
+        <w:t xml:space="preserve"> lượng</w:t>
+      </w:r>
+      <w:r>
+        <w:rPr>
+          <w:lang w:val="vi-VN"/>
+        </w:rPr>
+        <w:t xml:space="preserve"> câu hỏi xuất hiện trong bài kiểm tra </w:t>
+      </w:r>
+      <w:r>
+        <w:rPr>
+          <w:lang w:val="vi-VN"/>
+        </w:rPr>
+        <w:t>sau khi đề xuất &lt;= số lượng câu hỏi do</w:t>
+      </w:r>
+      <w:r>
+        <w:rPr>
+          <w:lang w:val="vi-VN"/>
+        </w:rPr>
+        <w:t xml:space="preserve"> mentor config </w:t>
+      </w:r>
+      <w:r>
+        <w:rPr>
+          <w:lang w:val="vi-VN"/>
+        </w:rPr>
+        <w:t>.</w:t>
+      </w:r>
+    </w:p>
+    <w:p>
+      <w:pPr>
+        <w:pStyle w:val="ListParagraph"/>
+        <w:numPr>
+          <w:ilvl w:val="1"/>
+          <w:numId w:val="8"/>
+        </w:numPr>
+        <w:rPr>
+          <w:lang w:val="vi-VN"/>
+        </w:rPr>
+      </w:pPr>
+      <w:r>
+        <w:rPr>
+          <w:lang w:val="vi-VN"/>
+        </w:rPr>
+        <w:t>-Số</w:t>
+      </w:r>
+      <w:r>
+        <w:rPr>
+          <w:lang w:val="vi-VN"/>
+        </w:rPr>
+        <w:t xml:space="preserve"> lượng</w:t>
+      </w:r>
+      <w:r>
+        <w:rPr>
+          <w:lang w:val="vi-VN"/>
+        </w:rPr>
+        <w:t xml:space="preserve"> section xuất hiện trong bài kiểm tra </w:t>
+      </w:r>
+      <w:r>
+        <w:rPr>
+          <w:lang w:val="vi-VN"/>
+        </w:rPr>
+        <w:t>&lt;= số lượng section</w:t>
+      </w:r>
+      <w:r>
+        <w:rPr>
+          <w:lang w:val="vi-VN"/>
+        </w:rPr>
+        <w:t xml:space="preserve"> mentor config.</w:t>
+      </w:r>
+    </w:p>
+    <w:p>
+      <w:pPr>
+        <w:pStyle w:val="ListParagraph"/>
+        <w:numPr>
+          <w:ilvl w:val="1"/>
+          <w:numId w:val="8"/>
+        </w:numPr>
+        <w:rPr>
+          <w:lang w:val="vi-VN"/>
+        </w:rPr>
+      </w:pPr>
+      <w:r>
+        <w:rPr>
+          <w:lang w:val="vi-VN"/>
+        </w:rPr>
+        <w:t>-</w:t>
+      </w:r>
+      <w:proofErr w:type="spellStart"/>
+      <w:r>
+        <w:t>Nếu</w:t>
+      </w:r>
+      <w:proofErr w:type="spellEnd"/>
+      <w:r>
+        <w:t xml:space="preserve"> chapter </w:t>
+      </w:r>
+      <w:proofErr w:type="spellStart"/>
+      <w:r>
+        <w:t>không</w:t>
+      </w:r>
+      <w:proofErr w:type="spellEnd"/>
+      <w:r>
+        <w:t xml:space="preserve"> </w:t>
+      </w:r>
+      <w:proofErr w:type="spellStart"/>
+      <w:r>
+        <w:t>đủ</w:t>
+      </w:r>
+      <w:proofErr w:type="spellEnd"/>
+      <w:r>
+        <w:t xml:space="preserve"> section</w:t>
+      </w:r>
+      <w:r>
+        <w:rPr>
+          <w:lang w:val="vi-VN"/>
+        </w:rPr>
+        <w:t xml:space="preserve"> trong question bank</w:t>
+      </w:r>
+      <w:r>
+        <w:t xml:space="preserve"> </w:t>
+      </w:r>
+      <w:proofErr w:type="spellStart"/>
+      <w:r>
+        <w:t>thì</w:t>
+      </w:r>
+      <w:proofErr w:type="spellEnd"/>
+      <w:r>
+        <w:t>:</w:t>
+      </w:r>
+      <w:r>
+        <w:rPr>
+          <w:lang w:val="vi-VN"/>
+        </w:rPr>
+        <w:t xml:space="preserve"> </w:t>
+      </w:r>
+      <w:proofErr w:type="spellStart"/>
+      <w:r>
+        <w:t>Lấy</w:t>
+      </w:r>
+      <w:proofErr w:type="spellEnd"/>
+      <w:r>
+        <w:t xml:space="preserve"> </w:t>
+      </w:r>
+      <w:proofErr w:type="spellStart"/>
+      <w:r>
+        <w:t>toàn</w:t>
+      </w:r>
+      <w:proofErr w:type="spellEnd"/>
+      <w:r>
+        <w:t xml:space="preserve"> </w:t>
+      </w:r>
+      <w:proofErr w:type="spellStart"/>
+      <w:r>
+        <w:t>bộ</w:t>
+      </w:r>
+      <w:proofErr w:type="spellEnd"/>
+      <w:r>
+        <w:t xml:space="preserve"> section </w:t>
+      </w:r>
+      <w:proofErr w:type="spellStart"/>
+      <w:r>
+        <w:t>của</w:t>
+      </w:r>
+      <w:proofErr w:type="spellEnd"/>
+      <w:r>
+        <w:rPr>
+          <w:lang w:val="vi-VN"/>
+        </w:rPr>
+        <w:t xml:space="preserve"> chương đó</w:t>
+      </w:r>
+      <w:r>
+        <w:rPr>
+          <w:lang w:val="vi-VN"/>
+        </w:rPr>
+        <w:t xml:space="preserve"> (phần section còn thiếu sẽ </w:t>
+      </w:r>
+      <w:proofErr w:type="spellStart"/>
+      <w:r>
+        <w:t>bù</w:t>
+      </w:r>
+      <w:proofErr w:type="spellEnd"/>
+      <w:r>
+        <w:t xml:space="preserve"> sang </w:t>
+      </w:r>
+      <w:proofErr w:type="spellStart"/>
+      <w:r>
+        <w:t>chương</w:t>
+      </w:r>
+      <w:proofErr w:type="spellEnd"/>
+      <w:r>
+        <w:t xml:space="preserve"> </w:t>
+      </w:r>
+      <w:proofErr w:type="spellStart"/>
+      <w:r>
+        <w:t>khác</w:t>
+      </w:r>
+      <w:proofErr w:type="spellEnd"/>
+      <w:r>
+        <w:t xml:space="preserve"> </w:t>
+      </w:r>
+      <w:proofErr w:type="spellStart"/>
+      <w:r>
+        <w:t>theo</w:t>
+      </w:r>
+      <w:proofErr w:type="spellEnd"/>
+      <w:r>
+        <w:t xml:space="preserve"> weight </w:t>
+      </w:r>
+      <w:proofErr w:type="spellStart"/>
+      <w:r>
+        <w:t>từ</w:t>
+      </w:r>
+      <w:proofErr w:type="spellEnd"/>
+      <w:r>
+        <w:t xml:space="preserve"> </w:t>
+      </w:r>
+      <w:proofErr w:type="spellStart"/>
+      <w:r>
+        <w:t>cao</w:t>
+      </w:r>
+      <w:proofErr w:type="spellEnd"/>
+      <w:r>
+        <w:t xml:space="preserve"> </w:t>
+      </w:r>
+      <w:proofErr w:type="spellStart"/>
+      <w:r>
+        <w:t>xuống</w:t>
+      </w:r>
+      <w:proofErr w:type="spellEnd"/>
+      <w:r>
+        <w:t xml:space="preserve"> </w:t>
+      </w:r>
+      <w:proofErr w:type="spellStart"/>
+      <w:r>
+        <w:t>thấp</w:t>
+      </w:r>
+      <w:proofErr w:type="spellEnd"/>
+      <w:r>
+        <w:rPr>
+          <w:lang w:val="vi-VN"/>
+        </w:rPr>
+        <w:t>)</w:t>
+      </w:r>
+      <w:r>
+        <w:rPr>
+          <w:lang w:val="vi-VN"/>
+        </w:rPr>
+        <w:t>. Lấy random nếu</w:t>
+      </w:r>
+      <w:r>
+        <w:t xml:space="preserve"> </w:t>
+      </w:r>
+      <w:proofErr w:type="spellStart"/>
+      <w:r>
+        <w:t>đủ</w:t>
+      </w:r>
+      <w:proofErr w:type="spellEnd"/>
+      <w:r>
+        <w:t xml:space="preserve"> section</w:t>
+      </w:r>
+      <w:r>
+        <w:rPr>
+          <w:lang w:val="vi-VN"/>
+        </w:rPr>
+        <w:t xml:space="preserve"> trong question bank</w:t>
+      </w:r>
+      <w:r>
+        <w:t>.</w:t>
+      </w:r>
+    </w:p>
+    <w:p>
+      <w:pPr>
+        <w:pStyle w:val="ListParagraph"/>
+        <w:numPr>
+          <w:ilvl w:val="1"/>
+          <w:numId w:val="8"/>
+        </w:numPr>
+        <w:rPr>
+          <w:lang w:val="vi-VN"/>
+        </w:rPr>
+      </w:pPr>
+      <w:r>
+        <w:rPr>
+          <w:lang w:val="vi-VN"/>
+        </w:rPr>
+        <w:t>-Chương nào có weight = 0 -&gt; không xuất hiện trong lần làm lại tiếp theo</w:t>
+      </w:r>
+    </w:p>
+    <w:p>
+      <w:pPr>
+        <w:pStyle w:val="ListParagraph"/>
+        <w:numPr>
+          <w:ilvl w:val="1"/>
+          <w:numId w:val="8"/>
+        </w:numPr>
+        <w:rPr>
+          <w:lang w:val="vi-VN"/>
+        </w:rPr>
+      </w:pPr>
+      <w:r>
+        <w:rPr>
+          <w:lang w:val="vi-VN"/>
+        </w:rPr>
+        <w:t>-</w:t>
+      </w:r>
+      <w:proofErr w:type="spellStart"/>
+      <w:r>
+        <w:t>Nếu</w:t>
+      </w:r>
+      <w:proofErr w:type="spellEnd"/>
+      <w:r>
+        <w:t xml:space="preserve"> </w:t>
+      </w:r>
+      <w:proofErr w:type="spellStart"/>
+      <w:r>
+        <w:t>đã</w:t>
+      </w:r>
+      <w:proofErr w:type="spellEnd"/>
+      <w:r>
+        <w:t xml:space="preserve"> </w:t>
+      </w:r>
+      <w:proofErr w:type="spellStart"/>
+      <w:r>
+        <w:t>bù</w:t>
+      </w:r>
+      <w:proofErr w:type="spellEnd"/>
+      <w:r>
+        <w:t xml:space="preserve"> </w:t>
+      </w:r>
+      <w:proofErr w:type="spellStart"/>
+      <w:r>
+        <w:t>hết</w:t>
+      </w:r>
+      <w:proofErr w:type="spellEnd"/>
+      <w:r>
+        <w:t xml:space="preserve"> </w:t>
+      </w:r>
+      <w:proofErr w:type="spellStart"/>
+      <w:r>
+        <w:t>các</w:t>
+      </w:r>
+      <w:proofErr w:type="spellEnd"/>
+      <w:r>
+        <w:t xml:space="preserve"> </w:t>
+      </w:r>
+      <w:proofErr w:type="spellStart"/>
+      <w:r>
+        <w:t>chương</w:t>
+      </w:r>
+      <w:proofErr w:type="spellEnd"/>
+      <w:r>
+        <w:t xml:space="preserve"> (</w:t>
+      </w:r>
+      <w:proofErr w:type="spellStart"/>
+      <w:r>
+        <w:t>theo</w:t>
+      </w:r>
+      <w:proofErr w:type="spellEnd"/>
+      <w:r>
+        <w:t xml:space="preserve"> weight </w:t>
+      </w:r>
+      <w:proofErr w:type="spellStart"/>
+      <w:r>
+        <w:t>từ</w:t>
+      </w:r>
+      <w:proofErr w:type="spellEnd"/>
+      <w:r>
+        <w:t xml:space="preserve"> </w:t>
+      </w:r>
+      <w:proofErr w:type="spellStart"/>
+      <w:r>
+        <w:t>cao</w:t>
+      </w:r>
+      <w:proofErr w:type="spellEnd"/>
+      <w:r>
+        <w:t xml:space="preserve"> </w:t>
+      </w:r>
+      <w:proofErr w:type="spellStart"/>
+      <w:r>
+        <w:t>xuống</w:t>
+      </w:r>
+      <w:proofErr w:type="spellEnd"/>
+      <w:r>
+        <w:t xml:space="preserve"> </w:t>
+      </w:r>
+      <w:proofErr w:type="spellStart"/>
+      <w:r>
+        <w:t>thấp</w:t>
+      </w:r>
+      <w:proofErr w:type="spellEnd"/>
+      <w:r>
+        <w:t xml:space="preserve">) </w:t>
+      </w:r>
+      <w:proofErr w:type="spellStart"/>
+      <w:r>
+        <w:t>mà</w:t>
+      </w:r>
+      <w:proofErr w:type="spellEnd"/>
+      <w:r>
+        <w:t xml:space="preserve"> question bank </w:t>
+      </w:r>
+      <w:proofErr w:type="spellStart"/>
+      <w:r>
+        <w:t>vẫn</w:t>
+      </w:r>
+      <w:proofErr w:type="spellEnd"/>
+      <w:r>
+        <w:t xml:space="preserve"> </w:t>
+      </w:r>
+      <w:proofErr w:type="spellStart"/>
+      <w:r>
+        <w:t>không</w:t>
+      </w:r>
+      <w:proofErr w:type="spellEnd"/>
+      <w:r>
+        <w:t xml:space="preserve"> </w:t>
+      </w:r>
+      <w:proofErr w:type="spellStart"/>
+      <w:r>
+        <w:t>đủ</w:t>
+      </w:r>
+      <w:proofErr w:type="spellEnd"/>
+      <w:r>
+        <w:t xml:space="preserve"> → </w:t>
+      </w:r>
+      <w:proofErr w:type="spellStart"/>
+      <w:r>
+        <w:t>dừng</w:t>
+      </w:r>
+      <w:proofErr w:type="spellEnd"/>
+      <w:r>
+        <w:t xml:space="preserve"> </w:t>
+      </w:r>
+      <w:proofErr w:type="spellStart"/>
+      <w:r>
+        <w:t>bù</w:t>
+      </w:r>
+      <w:proofErr w:type="spellEnd"/>
+      <w:r>
+        <w:t xml:space="preserve">, </w:t>
+      </w:r>
+      <w:proofErr w:type="spellStart"/>
+      <w:r>
+        <w:t>chấp</w:t>
+      </w:r>
+      <w:proofErr w:type="spellEnd"/>
+      <w:r>
+        <w:t xml:space="preserve"> </w:t>
+      </w:r>
+      <w:proofErr w:type="spellStart"/>
+      <w:r>
+        <w:t>nhận</w:t>
+      </w:r>
+      <w:proofErr w:type="spellEnd"/>
+      <w:r>
+        <w:t xml:space="preserve"> </w:t>
+      </w:r>
+      <w:proofErr w:type="spellStart"/>
+      <w:r>
+        <w:t>tổng</w:t>
+      </w:r>
+      <w:proofErr w:type="spellEnd"/>
+      <w:r>
+        <w:t xml:space="preserve"> section/</w:t>
+      </w:r>
+      <w:proofErr w:type="spellStart"/>
+      <w:r>
+        <w:t>câu</w:t>
+      </w:r>
+      <w:proofErr w:type="spellEnd"/>
+      <w:r>
+        <w:t xml:space="preserve"> </w:t>
+      </w:r>
+      <w:proofErr w:type="spellStart"/>
+      <w:r>
+        <w:t>hiện</w:t>
+      </w:r>
+      <w:proofErr w:type="spellEnd"/>
+      <w:r>
+        <w:t xml:space="preserve"> </w:t>
+      </w:r>
+      <w:proofErr w:type="spellStart"/>
+      <w:r>
+        <w:t>tại</w:t>
+      </w:r>
+      <w:proofErr w:type="spellEnd"/>
+      <w:r>
+        <w:t xml:space="preserve"> (</w:t>
+      </w:r>
+      <w:proofErr w:type="spellStart"/>
+      <w:r>
+        <w:t>vẫn</w:t>
+      </w:r>
+      <w:proofErr w:type="spellEnd"/>
+      <w:r>
+        <w:t xml:space="preserve"> </w:t>
+      </w:r>
+      <w:proofErr w:type="spellStart"/>
+      <w:r>
+        <w:t>phải</w:t>
+      </w:r>
+      <w:proofErr w:type="spellEnd"/>
+      <w:r>
+        <w:t xml:space="preserve"> ≤ mentor </w:t>
+      </w:r>
+      <w:r>
+        <w:t>config).</w:t>
       </w:r>
     </w:p>
     <w:p>
@@ -957,68 +2125,70 @@
           <w:lang w:val="vi-VN"/>
         </w:rPr>
       </w:pPr>
-      <w:r>
-        <w:rPr>
-          <w:lang w:val="vi-VN"/>
-        </w:rPr>
-        <w:t>-Số section xuất hiện trong bài kiểm tra do mentor config phải giữa nguyên.</w:t>
+    </w:p>
+    <w:p>
+      <w:pPr>
+        <w:rPr>
+          <w:b/>
+          <w:bCs/>
+          <w:lang w:val="vi-VN"/>
+        </w:rPr>
+      </w:pPr>
+      <w:r>
+        <w:rPr>
+          <w:b/>
+          <w:bCs/>
+          <w:lang w:val="vi-VN"/>
+        </w:rPr>
+        <w:t>Ví dụ — Trường hợp weight = 0:</w:t>
+      </w:r>
+    </w:p>
+    <w:p>
+      <w:pPr>
+        <w:rPr>
+          <w:lang w:val="vi-VN"/>
+        </w:rPr>
+      </w:pPr>
+      <w:r>
+        <w:rPr>
+          <w:lang w:val="vi-VN"/>
+        </w:rPr>
+        <w:t>Mentor config: C1 = 13 câu, C2 = 17 câu, C3 = 19 câu (tổng 49 câu).</w:t>
+      </w:r>
+    </w:p>
+    <w:p>
+      <w:pPr>
+        <w:rPr>
+          <w:lang w:val="vi-VN"/>
+        </w:rPr>
+      </w:pPr>
+      <w:r>
+        <w:rPr>
+          <w:lang w:val="vi-VN"/>
+        </w:rPr>
+        <w:t>Sau đề xuất: C3 weight = 0 → C3 không xuất hiện.</w:t>
+      </w:r>
+    </w:p>
+    <w:p>
+      <w:pPr>
+        <w:rPr>
+          <w:lang w:val="vi-VN"/>
+        </w:rPr>
+      </w:pPr>
+      <w:r>
+        <w:rPr>
+          <w:lang w:val="vi-VN"/>
+        </w:rPr>
+        <w:t>Chỉ lấy câu theo config của C1 và C2 → tổng = 30 câu ≤ 49 câu mentor.</w:t>
       </w:r>
     </w:p>
     <w:p>
       <w:pPr>
         <w:ind w:firstLine="720"/>
-      </w:pPr>
-      <w:r>
-        <w:rPr>
-          <w:lang w:val="vi-VN"/>
-        </w:rPr>
-        <w:t>-</w:t>
-      </w:r>
-      <w:r>
-        <w:t>Nếu chapter không đủ section</w:t>
-      </w:r>
-      <w:r>
-        <w:rPr>
-          <w:lang w:val="vi-VN"/>
-        </w:rPr>
-        <w:t xml:space="preserve"> trong question bank</w:t>
-      </w:r>
-      <w:r>
-        <w:t xml:space="preserve"> thì:</w:t>
-      </w:r>
-      <w:r>
-        <w:rPr>
-          <w:lang w:val="vi-VN"/>
-        </w:rPr>
-        <w:t xml:space="preserve"> </w:t>
-      </w:r>
-      <w:r>
-        <w:t xml:space="preserve">Lấy toàn bộ section </w:t>
-      </w:r>
-      <w:r>
-        <w:t>của</w:t>
-      </w:r>
-      <w:r>
-        <w:rPr>
-          <w:lang w:val="vi-VN"/>
-        </w:rPr>
-        <w:t xml:space="preserve"> chương đó. Lấy random nếu</w:t>
-      </w:r>
-      <w:r>
-        <w:t xml:space="preserve"> </w:t>
-      </w:r>
-      <w:r>
-        <w:t>đủ section</w:t>
-      </w:r>
-      <w:r>
-        <w:rPr>
-          <w:lang w:val="vi-VN"/>
-        </w:rPr>
-        <w:t xml:space="preserve"> trong question bank</w:t>
-      </w:r>
-      <w:r>
-        <w:t>.</w:t>
-      </w:r>
+        <w:rPr>
+          <w:lang w:val="vi-VN"/>
+        </w:rPr>
+      </w:pPr>
     </w:p>
     <w:p>
       <w:pPr>
@@ -1041,8 +2211,10 @@
       </w:pPr>
       <w:r>
         <w:rPr>
-          <w:lang w:val="vi-VN"/>
-        </w:rPr>
+          <w:noProof/>
+          <w:lang w:val="vi-VN"/>
+        </w:rPr>
+        <w:lastRenderedPageBreak/>
         <w:drawing>
           <wp:inline distT="0" distB="0" distL="0" distR="0" wp14:anchorId="3E0FD5D9" wp14:editId="56C7672C">
             <wp:extent cx="5943600" cy="3131185"/>
@@ -1115,7 +2287,6 @@
         <w:rPr>
           <w:lang w:val="vi-VN"/>
         </w:rPr>
-        <w:lastRenderedPageBreak/>
         <w:t xml:space="preserve">Chương 2: Weight = </w:t>
       </w:r>
       <w:r>
@@ -1195,9 +2366,11 @@
         </w:rPr>
         <w:t xml:space="preserve"> </w:t>
       </w:r>
+      <w:proofErr w:type="spellStart"/>
       <w:r>
         <w:t>Xếp</w:t>
       </w:r>
+      <w:proofErr w:type="spellEnd"/>
       <w:r>
         <w:rPr>
           <w:lang w:val="vi-VN"/>
@@ -1541,255 +2714,493 @@
         <w:rPr>
           <w:lang w:val="vi-VN"/>
         </w:rPr>
+        <w:lastRenderedPageBreak/>
+        <w:t xml:space="preserve">Chương 2 : 0.47 / 1.54 * 12 = ~  </w:t>
+      </w:r>
+      <w:r>
+        <w:rPr>
+          <w:lang w:val="vi-VN"/>
+        </w:rPr>
+        <w:t>3.67 = 3</w:t>
+      </w:r>
+      <w:r>
+        <w:rPr>
+          <w:lang w:val="vi-VN"/>
+        </w:rPr>
+        <w:t xml:space="preserve"> Section</w:t>
+      </w:r>
+    </w:p>
+    <w:p>
+      <w:pPr>
+        <w:rPr>
+          <w:lang w:val="vi-VN"/>
+        </w:rPr>
+      </w:pPr>
+      <w:r>
+        <w:rPr>
+          <w:lang w:val="vi-VN"/>
+        </w:rPr>
         <w:t xml:space="preserve">Chương </w:t>
       </w:r>
       <w:r>
         <w:rPr>
           <w:lang w:val="vi-VN"/>
         </w:rPr>
+        <w:t>3</w:t>
+      </w:r>
+      <w:r>
+        <w:rPr>
+          <w:lang w:val="vi-VN"/>
+        </w:rPr>
+        <w:t xml:space="preserve"> : 0.</w:t>
+      </w:r>
+      <w:r>
+        <w:rPr>
+          <w:lang w:val="vi-VN"/>
+        </w:rPr>
+        <w:t xml:space="preserve">53 </w:t>
+      </w:r>
+      <w:r>
+        <w:rPr>
+          <w:lang w:val="vi-VN"/>
+        </w:rPr>
+        <w:t xml:space="preserve">/ 1.54 * 12 = ~ </w:t>
+      </w:r>
+      <w:r>
+        <w:rPr>
+          <w:lang w:val="vi-VN"/>
+        </w:rPr>
+        <w:t>4.13 = 4</w:t>
+      </w:r>
+      <w:r>
+        <w:rPr>
+          <w:lang w:val="vi-VN"/>
+        </w:rPr>
+        <w:t xml:space="preserve"> Section</w:t>
+      </w:r>
+    </w:p>
+    <w:p>
+      <w:pPr>
+        <w:rPr>
+          <w:lang w:val="vi-VN"/>
+        </w:rPr>
+      </w:pPr>
+      <w:r>
+        <w:rPr>
+          <w:lang w:val="vi-VN"/>
+        </w:rPr>
+        <w:t xml:space="preserve">Tổng section hiện tại = 11 &lt; Tổng </w:t>
+      </w:r>
+      <w:r>
+        <w:rPr>
+          <w:lang w:val="vi-VN"/>
+        </w:rPr>
+        <w:t xml:space="preserve">section </w:t>
+      </w:r>
+      <w:r>
+        <w:rPr>
+          <w:lang w:val="vi-VN"/>
+        </w:rPr>
+        <w:t>Mentor’s config = 12</w:t>
+      </w:r>
+    </w:p>
+    <w:p>
+      <w:pPr>
+        <w:rPr>
+          <w:b/>
+          <w:bCs/>
+          <w:lang w:val="vi-VN"/>
+        </w:rPr>
+      </w:pPr>
+      <w:r>
+        <w:rPr>
+          <w:b/>
+          <w:bCs/>
+          <w:lang w:val="vi-VN"/>
+        </w:rPr>
+        <w:t xml:space="preserve">Lượng còn thiếu sẽ bù vào </w:t>
+      </w:r>
+      <w:r>
+        <w:rPr>
+          <w:b/>
+          <w:bCs/>
+          <w:lang w:val="vi-VN"/>
+        </w:rPr>
+        <w:t xml:space="preserve">chương có Weight cao nhất </w:t>
+      </w:r>
+      <w:r>
+        <w:rPr>
+          <w:b/>
+          <w:bCs/>
+          <w:lang w:val="vi-VN"/>
+        </w:rPr>
+        <w:t>(từ trên xuống)</w:t>
+      </w:r>
+    </w:p>
+    <w:p>
+      <w:pPr>
+        <w:rPr>
+          <w:lang w:val="vi-VN"/>
+        </w:rPr>
+      </w:pPr>
+      <w:r>
+        <w:rPr>
+          <w:lang w:val="vi-VN"/>
+        </w:rPr>
+        <w:t>=&gt;Lượng section mỗi chương sau khi tính toán:</w:t>
+      </w:r>
+    </w:p>
+    <w:p>
+      <w:pPr>
+        <w:rPr>
+          <w:lang w:val="vi-VN"/>
+        </w:rPr>
+      </w:pPr>
+      <w:r>
+        <w:rPr>
+          <w:lang w:val="vi-VN"/>
+        </w:rPr>
+        <w:t>Chương 1 : 5 Section</w:t>
+      </w:r>
+    </w:p>
+    <w:p>
+      <w:pPr>
+        <w:rPr>
+          <w:lang w:val="vi-VN"/>
+        </w:rPr>
+      </w:pPr>
+      <w:r>
+        <w:rPr>
+          <w:lang w:val="vi-VN"/>
+        </w:rPr>
+        <w:t>Chương 2 : 3 Section</w:t>
+      </w:r>
+    </w:p>
+    <w:p>
+      <w:pPr>
+        <w:rPr>
+          <w:lang w:val="vi-VN"/>
+        </w:rPr>
+      </w:pPr>
+      <w:r>
+        <w:rPr>
+          <w:lang w:val="vi-VN"/>
+        </w:rPr>
+        <w:t>Chương 3 : 4 Section</w:t>
+      </w:r>
+    </w:p>
+    <w:p>
+      <w:pPr>
+        <w:rPr>
+          <w:lang w:val="vi-VN"/>
+        </w:rPr>
+      </w:pPr>
+      <w:r>
+        <w:rPr>
+          <w:lang w:val="vi-VN"/>
+        </w:rPr>
+        <w:t xml:space="preserve">=&gt;Đối chiếu với question bank : Nếu lượng section hiện tại của chương &gt; lượng section trong Question bank =&gt; Lấy toàn bộ  Section của chương đó </w:t>
+      </w:r>
+    </w:p>
+    <w:p>
+      <w:pPr>
+        <w:rPr>
+          <w:b/>
+          <w:bCs/>
+          <w:lang w:val="vi-VN"/>
+        </w:rPr>
+      </w:pPr>
+      <w:r>
+        <w:rPr>
+          <w:b/>
+          <w:bCs/>
+          <w:lang w:val="vi-VN"/>
+        </w:rPr>
+        <w:t xml:space="preserve">Phần section còn thiếu sẽ bù vào Chương khác dựa theo </w:t>
+      </w:r>
+      <w:r>
+        <w:rPr>
+          <w:b/>
+          <w:bCs/>
+          <w:lang w:val="vi-VN"/>
+        </w:rPr>
+        <w:t xml:space="preserve">Weight </w:t>
+      </w:r>
+      <w:r>
+        <w:rPr>
+          <w:b/>
+          <w:bCs/>
+          <w:lang w:val="vi-VN"/>
+        </w:rPr>
+        <w:t>từ cao xuống thấp</w:t>
+      </w:r>
+    </w:p>
+    <w:p>
+      <w:pPr>
+        <w:rPr>
+          <w:lang w:val="vi-VN"/>
+        </w:rPr>
+      </w:pPr>
+    </w:p>
+    <w:p>
+      <w:pPr>
+        <w:rPr>
+          <w:lang w:val="vi-VN"/>
+        </w:rPr>
+      </w:pPr>
+    </w:p>
+    <w:p>
+      <w:pPr>
+        <w:rPr>
+          <w:lang w:val="vi-VN"/>
+        </w:rPr>
+      </w:pPr>
+    </w:p>
+    <w:p>
+      <w:pPr>
+        <w:rPr>
+          <w:lang w:val="vi-VN"/>
+        </w:rPr>
+      </w:pPr>
+      <w:r>
+        <w:rPr>
+          <w:lang w:val="vi-VN"/>
+        </w:rPr>
+        <w:t>4</w:t>
+      </w:r>
+      <w:r>
+        <w:rPr>
+          <w:lang w:val="vi-VN"/>
+        </w:rPr>
+        <w:t>.</w:t>
+      </w:r>
+      <w:r>
+        <w:t>Random</w:t>
+      </w:r>
+      <w:r>
+        <w:rPr>
+          <w:lang w:val="vi-VN"/>
+        </w:rPr>
+        <w:t xml:space="preserve"> </w:t>
+      </w:r>
+      <w:r>
+        <w:rPr>
+          <w:lang w:val="vi-VN"/>
+        </w:rPr>
+        <w:t>Câu hỏi theo section</w:t>
+      </w:r>
+    </w:p>
+    <w:p>
+      <w:pPr>
+        <w:rPr>
+          <w:lang w:val="vi-VN"/>
+        </w:rPr>
+      </w:pPr>
+      <w:r>
+        <w:rPr>
+          <w:lang w:val="vi-VN"/>
+        </w:rPr>
+        <w:t>Random đều theo lượng câu hỏi của mentor’s config</w:t>
+      </w:r>
+    </w:p>
+    <w:p>
+      <w:pPr>
+        <w:rPr>
+          <w:lang w:val="vi-VN"/>
+        </w:rPr>
+      </w:pPr>
+      <w:r>
+        <w:rPr>
+          <w:lang w:val="vi-VN"/>
+        </w:rPr>
+        <w:t>Hiện tại mentor’s config : chương 1 : 13 câu</w:t>
+      </w:r>
+    </w:p>
+    <w:p>
+      <w:pPr>
+        <w:rPr>
+          <w:lang w:val="vi-VN"/>
+        </w:rPr>
+      </w:pPr>
+      <w:r>
+        <w:rPr>
+          <w:lang w:val="vi-VN"/>
+        </w:rPr>
+        <w:t xml:space="preserve">                                                     Chương 2: 17 câu</w:t>
+      </w:r>
+    </w:p>
+    <w:p>
+      <w:pPr>
+        <w:ind w:left="2160"/>
+        <w:rPr>
+          <w:lang w:val="vi-VN"/>
+        </w:rPr>
+      </w:pPr>
+      <w:r>
+        <w:rPr>
+          <w:lang w:val="vi-VN"/>
+        </w:rPr>
+        <w:t xml:space="preserve">         Chương 3: 19 câu</w:t>
+      </w:r>
+    </w:p>
+    <w:p>
+      <w:pPr>
+        <w:rPr>
+          <w:lang w:val="vi-VN"/>
+        </w:rPr>
+      </w:pPr>
+      <w:r>
+        <w:rPr>
+          <w:lang w:val="vi-VN"/>
+        </w:rPr>
+        <w:t>Lượng section sau khi tính toán :</w:t>
+      </w:r>
+    </w:p>
+    <w:p>
+      <w:pPr>
+        <w:rPr>
+          <w:lang w:val="vi-VN"/>
+        </w:rPr>
+      </w:pPr>
+      <w:r>
+        <w:rPr>
+          <w:lang w:val="vi-VN"/>
+        </w:rPr>
+        <w:t xml:space="preserve">                                                       Chương 1 : 5 Section</w:t>
+      </w:r>
+    </w:p>
+    <w:p>
+      <w:pPr>
+        <w:rPr>
+          <w:lang w:val="vi-VN"/>
+        </w:rPr>
+      </w:pPr>
+      <w:r>
+        <w:rPr>
+          <w:lang w:val="vi-VN"/>
+        </w:rPr>
+        <w:t xml:space="preserve">                                                       Chương 2 : 3 Section</w:t>
+      </w:r>
+    </w:p>
+    <w:p>
+      <w:pPr>
+        <w:rPr>
+          <w:lang w:val="vi-VN"/>
+        </w:rPr>
+      </w:pPr>
+      <w:r>
+        <w:rPr>
+          <w:lang w:val="vi-VN"/>
+        </w:rPr>
+        <w:t xml:space="preserve">                                                       Chương 3 : 4 Section</w:t>
+      </w:r>
+    </w:p>
+    <w:p>
+      <w:pPr>
+        <w:rPr>
+          <w:lang w:val="vi-VN"/>
+        </w:rPr>
+      </w:pPr>
+      <w:r>
+        <w:rPr>
+          <w:lang w:val="vi-VN"/>
+        </w:rPr>
+        <w:t>=&gt;chia đều số câu hỏi cho các section :</w:t>
+      </w:r>
+    </w:p>
+    <w:p>
+      <w:pPr>
+        <w:rPr>
+          <w:lang w:val="vi-VN"/>
+        </w:rPr>
+      </w:pPr>
+      <w:r>
+        <w:rPr>
+          <w:lang w:val="vi-VN"/>
+        </w:rPr>
+        <w:t xml:space="preserve">Chương </w:t>
+      </w:r>
+      <w:r>
+        <w:rPr>
+          <w:lang w:val="vi-VN"/>
+        </w:rPr>
+        <w:t>1:</w:t>
+      </w:r>
+      <w:r>
+        <w:rPr>
+          <w:lang w:val="vi-VN"/>
+        </w:rPr>
+        <w:t xml:space="preserve"> 5 section -&gt; mỗi section lấy </w:t>
+      </w:r>
+      <w:r>
+        <w:rPr>
+          <w:lang w:val="vi-VN"/>
+        </w:rPr>
+        <w:t>2 câu -&gt; còn thiếu 3 câu</w:t>
+      </w:r>
+      <w:r>
+        <w:rPr>
+          <w:lang w:val="vi-VN"/>
+        </w:rPr>
+        <w:t xml:space="preserve"> -&gt; lấy 3 câu ở section có nhiều câu hỏi nhất</w:t>
+      </w:r>
+      <w:r>
+        <w:rPr>
+          <w:lang w:val="vi-VN"/>
+        </w:rPr>
+        <w:t xml:space="preserve"> </w:t>
+      </w:r>
+    </w:p>
+    <w:p>
+      <w:pPr>
+        <w:rPr>
+          <w:lang w:val="vi-VN"/>
+        </w:rPr>
+      </w:pPr>
+      <w:r>
+        <w:rPr>
+          <w:lang w:val="vi-VN"/>
+        </w:rPr>
+        <w:lastRenderedPageBreak/>
+        <w:t>Chương 2: 3 section -&gt; mỗi section lấy 5 câu -&gt; còn thiếu 2 câu</w:t>
+      </w:r>
+      <w:r>
+        <w:rPr>
+          <w:lang w:val="vi-VN"/>
+        </w:rPr>
+        <w:t xml:space="preserve"> -&gt; lấy </w:t>
+      </w:r>
+      <w:r>
+        <w:rPr>
+          <w:lang w:val="vi-VN"/>
+        </w:rPr>
         <w:t>2</w:t>
       </w:r>
       <w:r>
         <w:rPr>
           <w:lang w:val="vi-VN"/>
         </w:rPr>
-        <w:t xml:space="preserve"> : 0.</w:t>
-      </w:r>
-      <w:r>
-        <w:rPr>
-          <w:lang w:val="vi-VN"/>
-        </w:rPr>
-        <w:t>47</w:t>
-      </w:r>
-      <w:r>
-        <w:rPr>
-          <w:lang w:val="vi-VN"/>
-        </w:rPr>
-        <w:t xml:space="preserve"> / 1.54 * 12 = ~  </w:t>
-      </w:r>
-      <w:r>
-        <w:rPr>
-          <w:lang w:val="vi-VN"/>
-        </w:rPr>
-        <w:t>3.67 = 3</w:t>
-      </w:r>
-      <w:r>
-        <w:rPr>
-          <w:lang w:val="vi-VN"/>
-        </w:rPr>
-        <w:t xml:space="preserve"> Section</w:t>
-      </w:r>
-    </w:p>
-    <w:p>
-      <w:pPr>
-        <w:rPr>
-          <w:lang w:val="vi-VN"/>
-        </w:rPr>
-      </w:pPr>
-      <w:r>
-        <w:rPr>
-          <w:lang w:val="vi-VN"/>
-        </w:rPr>
-        <w:t xml:space="preserve">Chương </w:t>
-      </w:r>
-      <w:r>
-        <w:rPr>
-          <w:lang w:val="vi-VN"/>
-        </w:rPr>
-        <w:t>3</w:t>
-      </w:r>
-      <w:r>
-        <w:rPr>
-          <w:lang w:val="vi-VN"/>
-        </w:rPr>
-        <w:t xml:space="preserve"> : 0.</w:t>
-      </w:r>
-      <w:r>
-        <w:rPr>
-          <w:lang w:val="vi-VN"/>
-        </w:rPr>
-        <w:t xml:space="preserve">53 </w:t>
-      </w:r>
-      <w:r>
-        <w:rPr>
-          <w:lang w:val="vi-VN"/>
-        </w:rPr>
-        <w:t xml:space="preserve">/ 1.54 * 12 = ~ </w:t>
-      </w:r>
-      <w:r>
-        <w:rPr>
-          <w:lang w:val="vi-VN"/>
-        </w:rPr>
-        <w:t>4.13 = 4</w:t>
-      </w:r>
-      <w:r>
-        <w:rPr>
-          <w:lang w:val="vi-VN"/>
-        </w:rPr>
-        <w:t xml:space="preserve"> Section</w:t>
-      </w:r>
-    </w:p>
-    <w:p>
-      <w:pPr>
-        <w:rPr>
-          <w:lang w:val="vi-VN"/>
-        </w:rPr>
-      </w:pPr>
-      <w:r>
-        <w:rPr>
-          <w:lang w:val="vi-VN"/>
-        </w:rPr>
-        <w:t>Tổng section hiện tại = 11 &lt; Tổng sectoin Mentor’s config = 12</w:t>
-      </w:r>
-    </w:p>
-    <w:p>
-      <w:pPr>
-        <w:rPr>
-          <w:lang w:val="vi-VN"/>
-        </w:rPr>
-      </w:pPr>
-      <w:r>
-        <w:rPr>
-          <w:lang w:val="vi-VN"/>
-        </w:rPr>
-        <w:t xml:space="preserve">Lượng còn thiếu sẽ bù vào </w:t>
-      </w:r>
-      <w:r>
-        <w:rPr>
-          <w:lang w:val="vi-VN"/>
-        </w:rPr>
-        <w:t xml:space="preserve">chương có Weight cao nhất </w:t>
-      </w:r>
-    </w:p>
-    <w:p>
-      <w:pPr>
-        <w:rPr>
-          <w:lang w:val="vi-VN"/>
-        </w:rPr>
-      </w:pPr>
-      <w:r>
-        <w:rPr>
-          <w:lang w:val="vi-VN"/>
-        </w:rPr>
-        <w:t>=&gt;Lượng section mỗi chương sau khi tính toán:</w:t>
-      </w:r>
-    </w:p>
-    <w:p>
-      <w:pPr>
-        <w:rPr>
-          <w:lang w:val="vi-VN"/>
-        </w:rPr>
-      </w:pPr>
-      <w:r>
-        <w:rPr>
-          <w:lang w:val="vi-VN"/>
-        </w:rPr>
-        <w:t xml:space="preserve">Chương 1 : </w:t>
-      </w:r>
-      <w:r>
-        <w:rPr>
-          <w:lang w:val="vi-VN"/>
-        </w:rPr>
-        <w:t xml:space="preserve">5 </w:t>
-      </w:r>
-      <w:r>
-        <w:rPr>
-          <w:lang w:val="vi-VN"/>
-        </w:rPr>
-        <w:t>Section</w:t>
-      </w:r>
-    </w:p>
-    <w:p>
-      <w:pPr>
-        <w:rPr>
-          <w:lang w:val="vi-VN"/>
-        </w:rPr>
-      </w:pPr>
-      <w:r>
-        <w:rPr>
-          <w:lang w:val="vi-VN"/>
-        </w:rPr>
-        <w:t>Chương 2 : 3 Section</w:t>
-      </w:r>
-    </w:p>
-    <w:p>
-      <w:pPr>
-        <w:rPr>
-          <w:lang w:val="vi-VN"/>
-        </w:rPr>
-      </w:pPr>
-      <w:r>
-        <w:rPr>
-          <w:lang w:val="vi-VN"/>
-        </w:rPr>
-        <w:t>Chương 3 : 4 Section</w:t>
-      </w:r>
-    </w:p>
-    <w:p>
-      <w:pPr>
-        <w:rPr>
-          <w:lang w:val="vi-VN"/>
-        </w:rPr>
-      </w:pPr>
-      <w:r>
-        <w:rPr>
-          <w:lang w:val="vi-VN"/>
-        </w:rPr>
-        <w:t xml:space="preserve">=&gt;Đối chiếu với question bank : Nếu lượng section hiện tại của chương &gt; lượng section trong Question bank =&gt; Lấy toàn bộ  Section của chương đó </w:t>
-      </w:r>
-    </w:p>
-    <w:p>
-      <w:pPr>
-        <w:rPr>
-          <w:lang w:val="vi-VN"/>
-        </w:rPr>
-      </w:pPr>
-      <w:r>
-        <w:rPr>
-          <w:lang w:val="vi-VN"/>
-        </w:rPr>
-        <w:t xml:space="preserve">Phần section còn thiếu sẽ bù vào Chương khác dựa theo </w:t>
-      </w:r>
-      <w:r>
-        <w:rPr>
-          <w:lang w:val="vi-VN"/>
-        </w:rPr>
-        <w:t xml:space="preserve">Weight </w:t>
-      </w:r>
-      <w:r>
-        <w:rPr>
-          <w:lang w:val="vi-VN"/>
-        </w:rPr>
-        <w:t>từ cao xuống thấp</w:t>
-      </w:r>
-    </w:p>
-    <w:p>
-      <w:pPr>
-        <w:rPr>
-          <w:lang w:val="vi-VN"/>
-        </w:rPr>
-      </w:pPr>
-    </w:p>
-    <w:p>
-      <w:pPr>
-        <w:rPr>
-          <w:lang w:val="vi-VN"/>
-        </w:rPr>
-      </w:pPr>
-    </w:p>
-    <w:p>
-      <w:pPr>
-        <w:rPr>
-          <w:lang w:val="vi-VN"/>
-        </w:rPr>
-      </w:pPr>
-    </w:p>
-    <w:p>
-      <w:pPr>
-        <w:rPr>
-          <w:lang w:val="vi-VN"/>
-        </w:rPr>
-      </w:pPr>
+        <w:t xml:space="preserve"> câu ở section có nhiều câu hỏi nhất</w:t>
+      </w:r>
+      <w:r>
+        <w:rPr>
+          <w:lang w:val="vi-VN"/>
+        </w:rPr>
+        <w:t xml:space="preserve">  </w:t>
+      </w:r>
+    </w:p>
+    <w:p>
+      <w:pPr>
+        <w:rPr>
+          <w:lang w:val="vi-VN"/>
+        </w:rPr>
+      </w:pPr>
+      <w:r>
+        <w:rPr>
+          <w:lang w:val="vi-VN"/>
+        </w:rPr>
+        <w:t xml:space="preserve">Chương 3: 4 section -&gt; mỗi section lấy </w:t>
+      </w:r>
       <w:r>
         <w:rPr>
           <w:lang w:val="vi-VN"/>
@@ -1800,189 +3211,7 @@
         <w:rPr>
           <w:lang w:val="vi-VN"/>
         </w:rPr>
-        <w:t>.</w:t>
-      </w:r>
-      <w:r>
-        <w:t>Random</w:t>
-      </w:r>
-      <w:r>
-        <w:rPr>
-          <w:lang w:val="vi-VN"/>
-        </w:rPr>
-        <w:t xml:space="preserve"> </w:t>
-      </w:r>
-      <w:r>
-        <w:rPr>
-          <w:lang w:val="vi-VN"/>
-        </w:rPr>
-        <w:t>Câu hỏi theo section</w:t>
-      </w:r>
-    </w:p>
-    <w:p>
-      <w:pPr>
-        <w:rPr>
-          <w:lang w:val="vi-VN"/>
-        </w:rPr>
-      </w:pPr>
-      <w:r>
-        <w:rPr>
-          <w:lang w:val="vi-VN"/>
-        </w:rPr>
-        <w:t>Random đều theo lượng câu hỏi của mentor’s config</w:t>
-      </w:r>
-    </w:p>
-    <w:p>
-      <w:pPr>
-        <w:rPr>
-          <w:lang w:val="vi-VN"/>
-        </w:rPr>
-      </w:pPr>
-      <w:r>
-        <w:rPr>
-          <w:lang w:val="vi-VN"/>
-        </w:rPr>
-        <w:t>Hiện tại mentor’s config : chương 1 : 13 câu</w:t>
-      </w:r>
-    </w:p>
-    <w:p>
-      <w:pPr>
-        <w:rPr>
-          <w:lang w:val="vi-VN"/>
-        </w:rPr>
-      </w:pPr>
-      <w:r>
-        <w:rPr>
-          <w:lang w:val="vi-VN"/>
-        </w:rPr>
-        <w:t xml:space="preserve">                                                     Chương 2: 17 câu</w:t>
-      </w:r>
-    </w:p>
-    <w:p>
-      <w:pPr>
-        <w:ind w:left="2160"/>
-        <w:rPr>
-          <w:lang w:val="vi-VN"/>
-        </w:rPr>
-      </w:pPr>
-      <w:r>
-        <w:rPr>
-          <w:lang w:val="vi-VN"/>
-        </w:rPr>
-        <w:t xml:space="preserve">         Chương 3: 19 câu</w:t>
-      </w:r>
-    </w:p>
-    <w:p>
-      <w:pPr>
-        <w:rPr>
-          <w:lang w:val="vi-VN"/>
-        </w:rPr>
-      </w:pPr>
-      <w:r>
-        <w:rPr>
-          <w:lang w:val="vi-VN"/>
-        </w:rPr>
-        <w:t>Lượng section sau khi tính toán :</w:t>
-      </w:r>
-    </w:p>
-    <w:p>
-      <w:pPr>
-        <w:rPr>
-          <w:lang w:val="vi-VN"/>
-        </w:rPr>
-      </w:pPr>
-      <w:r>
-        <w:rPr>
-          <w:lang w:val="vi-VN"/>
-        </w:rPr>
-        <w:t xml:space="preserve">                                                       </w:t>
-      </w:r>
-      <w:r>
-        <w:rPr>
-          <w:lang w:val="vi-VN"/>
-        </w:rPr>
-        <w:t>Chương 1 : 5 Section</w:t>
-      </w:r>
-    </w:p>
-    <w:p>
-      <w:pPr>
-        <w:rPr>
-          <w:lang w:val="vi-VN"/>
-        </w:rPr>
-      </w:pPr>
-      <w:r>
-        <w:rPr>
-          <w:lang w:val="vi-VN"/>
-        </w:rPr>
-        <w:t xml:space="preserve">                                                       </w:t>
-      </w:r>
-      <w:r>
-        <w:rPr>
-          <w:lang w:val="vi-VN"/>
-        </w:rPr>
-        <w:t>Chương 2 : 3 Section</w:t>
-      </w:r>
-    </w:p>
-    <w:p>
-      <w:pPr>
-        <w:rPr>
-          <w:lang w:val="vi-VN"/>
-        </w:rPr>
-      </w:pPr>
-      <w:r>
-        <w:rPr>
-          <w:lang w:val="vi-VN"/>
-        </w:rPr>
-        <w:t xml:space="preserve">                                                       </w:t>
-      </w:r>
-      <w:r>
-        <w:rPr>
-          <w:lang w:val="vi-VN"/>
-        </w:rPr>
-        <w:t>Chương 3 : 4 Section</w:t>
-      </w:r>
-    </w:p>
-    <w:p>
-      <w:pPr>
-        <w:rPr>
-          <w:lang w:val="vi-VN"/>
-        </w:rPr>
-      </w:pPr>
-      <w:r>
-        <w:rPr>
-          <w:lang w:val="vi-VN"/>
-        </w:rPr>
-        <w:t>=&gt;chia đều số câu hỏi cho các section :</w:t>
-      </w:r>
-    </w:p>
-    <w:p>
-      <w:pPr>
-        <w:rPr>
-          <w:lang w:val="vi-VN"/>
-        </w:rPr>
-      </w:pPr>
-      <w:r>
-        <w:rPr>
-          <w:lang w:val="vi-VN"/>
-        </w:rPr>
-        <w:t xml:space="preserve">Chương </w:t>
-      </w:r>
-      <w:r>
-        <w:rPr>
-          <w:lang w:val="vi-VN"/>
-        </w:rPr>
-        <w:t>1:</w:t>
-      </w:r>
-      <w:r>
-        <w:rPr>
-          <w:lang w:val="vi-VN"/>
-        </w:rPr>
-        <w:t xml:space="preserve"> 5 section -&gt; mỗi section lấy </w:t>
-      </w:r>
-      <w:r>
-        <w:rPr>
-          <w:lang w:val="vi-VN"/>
-        </w:rPr>
-        <w:t>2 câu -&gt; còn thiếu 3 câu</w:t>
+        <w:t xml:space="preserve"> câu -&gt; còn thiếu 3 câu</w:t>
       </w:r>
       <w:r>
         <w:rPr>
@@ -1990,146 +3219,13 @@
         </w:rPr>
         <w:t xml:space="preserve"> -&gt; lấy 3 câu ở section có nhiều câu hỏi nhất</w:t>
       </w:r>
-      <w:r>
-        <w:rPr>
-          <w:lang w:val="vi-VN"/>
-        </w:rPr>
-        <w:t xml:space="preserve"> </w:t>
-      </w:r>
-      <w:r>
-        <w:rPr>
-          <w:lang w:val="vi-VN"/>
-        </w:rPr>
-        <w:t xml:space="preserve"> </w:t>
-      </w:r>
-    </w:p>
-    <w:p>
-      <w:pPr>
-        <w:rPr>
-          <w:lang w:val="vi-VN"/>
-        </w:rPr>
-      </w:pPr>
-      <w:r>
-        <w:rPr>
-          <w:lang w:val="vi-VN"/>
-        </w:rPr>
-        <w:t xml:space="preserve">Chương </w:t>
-      </w:r>
-      <w:r>
-        <w:rPr>
-          <w:lang w:val="vi-VN"/>
-        </w:rPr>
-        <w:t>2:</w:t>
-      </w:r>
-      <w:r>
-        <w:rPr>
-          <w:lang w:val="vi-VN"/>
-        </w:rPr>
-        <w:t xml:space="preserve"> </w:t>
-      </w:r>
-      <w:r>
-        <w:rPr>
-          <w:lang w:val="vi-VN"/>
-        </w:rPr>
-        <w:t>3</w:t>
-      </w:r>
-      <w:r>
-        <w:rPr>
-          <w:lang w:val="vi-VN"/>
-        </w:rPr>
-        <w:t xml:space="preserve"> section -&gt; mỗi section lấy </w:t>
-      </w:r>
-      <w:r>
-        <w:rPr>
-          <w:lang w:val="vi-VN"/>
-        </w:rPr>
-        <w:t>5</w:t>
-      </w:r>
-      <w:r>
-        <w:rPr>
-          <w:lang w:val="vi-VN"/>
-        </w:rPr>
-        <w:t xml:space="preserve"> câu -&gt; còn thiếu </w:t>
-      </w:r>
-      <w:r>
-        <w:rPr>
-          <w:lang w:val="vi-VN"/>
-        </w:rPr>
-        <w:t>2</w:t>
-      </w:r>
-      <w:r>
-        <w:rPr>
-          <w:lang w:val="vi-VN"/>
-        </w:rPr>
-        <w:t xml:space="preserve"> câu</w:t>
-      </w:r>
-      <w:r>
-        <w:rPr>
-          <w:lang w:val="vi-VN"/>
-        </w:rPr>
-        <w:t xml:space="preserve"> -&gt; lấy 3 câu ở section có nhiều câu hỏi nhất</w:t>
-      </w:r>
-      <w:r>
-        <w:rPr>
-          <w:lang w:val="vi-VN"/>
-        </w:rPr>
-        <w:t xml:space="preserve">  </w:t>
-      </w:r>
-    </w:p>
-    <w:p>
-      <w:pPr>
-        <w:rPr>
-          <w:lang w:val="vi-VN"/>
-        </w:rPr>
-      </w:pPr>
-      <w:r>
-        <w:rPr>
-          <w:lang w:val="vi-VN"/>
-        </w:rPr>
-        <w:t xml:space="preserve">Chương </w:t>
-      </w:r>
-      <w:r>
-        <w:rPr>
-          <w:lang w:val="vi-VN"/>
-        </w:rPr>
-        <w:t>3:</w:t>
-      </w:r>
-      <w:r>
-        <w:rPr>
-          <w:lang w:val="vi-VN"/>
-        </w:rPr>
-        <w:t xml:space="preserve"> </w:t>
-      </w:r>
-      <w:r>
-        <w:rPr>
-          <w:lang w:val="vi-VN"/>
-        </w:rPr>
-        <w:t>4</w:t>
-      </w:r>
-      <w:r>
-        <w:rPr>
-          <w:lang w:val="vi-VN"/>
-        </w:rPr>
-        <w:t xml:space="preserve"> section -&gt; mỗi section lấy </w:t>
-      </w:r>
-      <w:r>
-        <w:rPr>
-          <w:lang w:val="vi-VN"/>
-        </w:rPr>
-        <w:t>4</w:t>
-      </w:r>
-      <w:r>
-        <w:rPr>
-          <w:lang w:val="vi-VN"/>
-        </w:rPr>
-        <w:t xml:space="preserve"> câu -&gt; còn thiếu 3 câu</w:t>
-      </w:r>
-      <w:r>
-        <w:rPr>
-          <w:lang w:val="vi-VN"/>
-        </w:rPr>
-        <w:t xml:space="preserve"> -&gt; lấy 3 câu ở section có nhiều câu hỏi nhất</w:t>
-      </w:r>
+    </w:p>
+    <w:p>
+      <w:pPr>
+        <w:rPr>
+          <w:lang w:val="vi-VN"/>
+        </w:rPr>
+      </w:pPr>
     </w:p>
     <w:p>
       <w:pPr>
@@ -2210,6 +3306,232 @@
 <file path=word/numbering.xml><?xml version="1.0" encoding="utf-8"?>
 <w:numbering xmlns:wpc="http://schemas.microsoft.com/office/word/2010/wordprocessingCanvas" xmlns:cx="http://schemas.microsoft.com/office/drawing/2014/chartex" xmlns:cx1="http://schemas.microsoft.com/office/drawing/2015/9/8/chartex" xmlns:cx2="http://schemas.microsoft.com/office/drawing/2015/10/21/chartex" xmlns:cx3="http://schemas.microsoft.com/office/drawing/2016/5/9/chartex" xmlns:cx4="http://schemas.microsoft.com/office/drawing/2016/5/10/chartex" xmlns:cx5="http://schemas.microsoft.com/office/drawing/2016/5/11/chartex" xmlns:cx6="http://schemas.microsoft.com/office/drawing/2016/5/12/chartex" xmlns:cx7="http://schemas.microsoft.com/office/drawing/2016/5/13/chartex" xmlns:cx8="http://schemas.microsoft.com/office/drawing/2016/5/14/chartex" xmlns:mc="http://schemas.openxmlformats.org/markup-compatibility/2006" xmlns:aink="http://schemas.microsoft.com/office/drawing/2016/ink" xmlns:am3d="http://schemas.microsoft.com/office/drawing/2017/model3d" xmlns:o="urn:schemas-microsoft-com:office:office" xmlns:oel="http://schemas.microsoft.com/office/2019/extlst" xmlns:r="http://schemas.openxmlformats.org/officeDocument/2006/relationships" xmlns:m="http://schemas.openxmlformats.org/officeDocument/2006/math" xmlns:v="urn:schemas-microsoft-com:vml" xmlns:wp14="http://schemas.microsoft.com/office/word/2010/wordprocessingDrawing" xmlns:wp="http://schemas.openxmlformats.org/drawingml/2006/wordprocessingDrawing" xmlns:w10="urn:schemas-microsoft-com:office:word" xmlns:w="http://schemas.openxmlformats.org/wordprocessingml/2006/main" xmlns:w14="http://schemas.microsoft.com/office/word/2010/wordml" xmlns:w15="http://schemas.microsoft.com/office/word/2012/wordml" xmlns:w16cex="http://schemas.microsoft.com/office/word/2018/wordml/cex" xmlns:w16cid="http://schemas.microsoft.com/office/word/2016/wordml/cid" xmlns:w16="http://schemas.microsoft.com/office/word/2018/wordml" xmlns:w16du="http://schemas.microsoft.com/office/word/2023/wordml/word16du" xmlns:w16sdtdh="http://schemas.microsoft.com/office/word/2020/wordml/sdtdatahash" xmlns:w16sdtfl="http://schemas.microsoft.com/office/word/2024/wordml/sdtformatlock" xmlns:w16se="http://schemas.microsoft.com/office/word/2015/wordml/symex" xmlns:wpg="http://schemas.microsoft.com/office/word/2010/wordprocessingGroup" xmlns:wpi="http://schemas.microsoft.com/office/word/2010/wordprocessingInk" xmlns:wne="http://schemas.microsoft.com/office/word/2006/wordml" xmlns:wps="http://schemas.microsoft.com/office/word/2010/wordprocessingShape" mc:Ignorable="w14 w15 w16se w16cid w16 w16cex w16sdtdh w16sdtfl w16du wp14">
   <w:abstractNum w:abstractNumId="0" w15:restartNumberingAfterBreak="0">
+    <w:nsid w:val="071B3929"/>
+    <w:multiLevelType w:val="hybridMultilevel"/>
+    <w:tmpl w:val="32C62F8E"/>
+    <w:lvl w:ilvl="0" w:tplc="04090001">
+      <w:start w:val="1"/>
+      <w:numFmt w:val="bullet"/>
+      <w:lvlText w:val=""/>
+      <w:lvlJc w:val="left"/>
+      <w:pPr>
+        <w:ind w:left="720" w:hanging="360"/>
+      </w:pPr>
+      <w:rPr>
+        <w:rFonts w:ascii="Symbol" w:hAnsi="Symbol" w:hint="default"/>
+      </w:rPr>
+    </w:lvl>
+    <w:lvl w:ilvl="1" w:tplc="04090003" w:tentative="1">
+      <w:start w:val="1"/>
+      <w:numFmt w:val="bullet"/>
+      <w:lvlText w:val="o"/>
+      <w:lvlJc w:val="left"/>
+      <w:pPr>
+        <w:ind w:left="1440" w:hanging="360"/>
+      </w:pPr>
+      <w:rPr>
+        <w:rFonts w:ascii="Courier New" w:hAnsi="Courier New" w:cs="Courier New" w:hint="default"/>
+      </w:rPr>
+    </w:lvl>
+    <w:lvl w:ilvl="2" w:tplc="04090005" w:tentative="1">
+      <w:start w:val="1"/>
+      <w:numFmt w:val="bullet"/>
+      <w:lvlText w:val=""/>
+      <w:lvlJc w:val="left"/>
+      <w:pPr>
+        <w:ind w:left="2160" w:hanging="360"/>
+      </w:pPr>
+      <w:rPr>
+        <w:rFonts w:ascii="Wingdings" w:hAnsi="Wingdings" w:hint="default"/>
+      </w:rPr>
+    </w:lvl>
+    <w:lvl w:ilvl="3" w:tplc="04090001" w:tentative="1">
+      <w:start w:val="1"/>
+      <w:numFmt w:val="bullet"/>
+      <w:lvlText w:val=""/>
+      <w:lvlJc w:val="left"/>
+      <w:pPr>
+        <w:ind w:left="2880" w:hanging="360"/>
+      </w:pPr>
+      <w:rPr>
+        <w:rFonts w:ascii="Symbol" w:hAnsi="Symbol" w:hint="default"/>
+      </w:rPr>
+    </w:lvl>
+    <w:lvl w:ilvl="4" w:tplc="04090003" w:tentative="1">
+      <w:start w:val="1"/>
+      <w:numFmt w:val="bullet"/>
+      <w:lvlText w:val="o"/>
+      <w:lvlJc w:val="left"/>
+      <w:pPr>
+        <w:ind w:left="3600" w:hanging="360"/>
+      </w:pPr>
+      <w:rPr>
+        <w:rFonts w:ascii="Courier New" w:hAnsi="Courier New" w:cs="Courier New" w:hint="default"/>
+      </w:rPr>
+    </w:lvl>
+    <w:lvl w:ilvl="5" w:tplc="04090005" w:tentative="1">
+      <w:start w:val="1"/>
+      <w:numFmt w:val="bullet"/>
+      <w:lvlText w:val=""/>
+      <w:lvlJc w:val="left"/>
+      <w:pPr>
+        <w:ind w:left="4320" w:hanging="360"/>
+      </w:pPr>
+      <w:rPr>
+        <w:rFonts w:ascii="Wingdings" w:hAnsi="Wingdings" w:hint="default"/>
+      </w:rPr>
+    </w:lvl>
+    <w:lvl w:ilvl="6" w:tplc="04090001" w:tentative="1">
+      <w:start w:val="1"/>
+      <w:numFmt w:val="bullet"/>
+      <w:lvlText w:val=""/>
+      <w:lvlJc w:val="left"/>
+      <w:pPr>
+        <w:ind w:left="5040" w:hanging="360"/>
+      </w:pPr>
+      <w:rPr>
+        <w:rFonts w:ascii="Symbol" w:hAnsi="Symbol" w:hint="default"/>
+      </w:rPr>
+    </w:lvl>
+    <w:lvl w:ilvl="7" w:tplc="04090003" w:tentative="1">
+      <w:start w:val="1"/>
+      <w:numFmt w:val="bullet"/>
+      <w:lvlText w:val="o"/>
+      <w:lvlJc w:val="left"/>
+      <w:pPr>
+        <w:ind w:left="5760" w:hanging="360"/>
+      </w:pPr>
+      <w:rPr>
+        <w:rFonts w:ascii="Courier New" w:hAnsi="Courier New" w:cs="Courier New" w:hint="default"/>
+      </w:rPr>
+    </w:lvl>
+    <w:lvl w:ilvl="8" w:tplc="04090005" w:tentative="1">
+      <w:start w:val="1"/>
+      <w:numFmt w:val="bullet"/>
+      <w:lvlText w:val=""/>
+      <w:lvlJc w:val="left"/>
+      <w:pPr>
+        <w:ind w:left="6480" w:hanging="360"/>
+      </w:pPr>
+      <w:rPr>
+        <w:rFonts w:ascii="Wingdings" w:hAnsi="Wingdings" w:hint="default"/>
+      </w:rPr>
+    </w:lvl>
+  </w:abstractNum>
+  <w:abstractNum w:abstractNumId="1" w15:restartNumberingAfterBreak="0">
+    <w:nsid w:val="3CB76EA3"/>
+    <w:multiLevelType w:val="hybridMultilevel"/>
+    <w:tmpl w:val="7A081004"/>
+    <w:lvl w:ilvl="0" w:tplc="04090001">
+      <w:start w:val="1"/>
+      <w:numFmt w:val="bullet"/>
+      <w:lvlText w:val=""/>
+      <w:lvlJc w:val="left"/>
+      <w:pPr>
+        <w:ind w:left="720" w:hanging="360"/>
+      </w:pPr>
+      <w:rPr>
+        <w:rFonts w:ascii="Symbol" w:hAnsi="Symbol" w:hint="default"/>
+      </w:rPr>
+    </w:lvl>
+    <w:lvl w:ilvl="1" w:tplc="04090003">
+      <w:start w:val="1"/>
+      <w:numFmt w:val="bullet"/>
+      <w:lvlText w:val="o"/>
+      <w:lvlJc w:val="left"/>
+      <w:pPr>
+        <w:ind w:left="1440" w:hanging="360"/>
+      </w:pPr>
+      <w:rPr>
+        <w:rFonts w:ascii="Courier New" w:hAnsi="Courier New" w:cs="Courier New" w:hint="default"/>
+      </w:rPr>
+    </w:lvl>
+    <w:lvl w:ilvl="2" w:tplc="04090005" w:tentative="1">
+      <w:start w:val="1"/>
+      <w:numFmt w:val="bullet"/>
+      <w:lvlText w:val=""/>
+      <w:lvlJc w:val="left"/>
+      <w:pPr>
+        <w:ind w:left="2160" w:hanging="360"/>
+      </w:pPr>
+      <w:rPr>
+        <w:rFonts w:ascii="Wingdings" w:hAnsi="Wingdings" w:hint="default"/>
+      </w:rPr>
+    </w:lvl>
+    <w:lvl w:ilvl="3" w:tplc="04090001" w:tentative="1">
+      <w:start w:val="1"/>
+      <w:numFmt w:val="bullet"/>
+      <w:lvlText w:val=""/>
+      <w:lvlJc w:val="left"/>
+      <w:pPr>
+        <w:ind w:left="2880" w:hanging="360"/>
+      </w:pPr>
+      <w:rPr>
+        <w:rFonts w:ascii="Symbol" w:hAnsi="Symbol" w:hint="default"/>
+      </w:rPr>
+    </w:lvl>
+    <w:lvl w:ilvl="4" w:tplc="04090003" w:tentative="1">
+      <w:start w:val="1"/>
+      <w:numFmt w:val="bullet"/>
+      <w:lvlText w:val="o"/>
+      <w:lvlJc w:val="left"/>
+      <w:pPr>
+        <w:ind w:left="3600" w:hanging="360"/>
+      </w:pPr>
+      <w:rPr>
+        <w:rFonts w:ascii="Courier New" w:hAnsi="Courier New" w:cs="Courier New" w:hint="default"/>
+      </w:rPr>
+    </w:lvl>
+    <w:lvl w:ilvl="5" w:tplc="04090005" w:tentative="1">
+      <w:start w:val="1"/>
+      <w:numFmt w:val="bullet"/>
+      <w:lvlText w:val=""/>
+      <w:lvlJc w:val="left"/>
+      <w:pPr>
+        <w:ind w:left="4320" w:hanging="360"/>
+      </w:pPr>
+      <w:rPr>
+        <w:rFonts w:ascii="Wingdings" w:hAnsi="Wingdings" w:hint="default"/>
+      </w:rPr>
+    </w:lvl>
+    <w:lvl w:ilvl="6" w:tplc="04090001" w:tentative="1">
+      <w:start w:val="1"/>
+      <w:numFmt w:val="bullet"/>
+      <w:lvlText w:val=""/>
+      <w:lvlJc w:val="left"/>
+      <w:pPr>
+        <w:ind w:left="5040" w:hanging="360"/>
+      </w:pPr>
+      <w:rPr>
+        <w:rFonts w:ascii="Symbol" w:hAnsi="Symbol" w:hint="default"/>
+      </w:rPr>
+    </w:lvl>
+    <w:lvl w:ilvl="7" w:tplc="04090003" w:tentative="1">
+      <w:start w:val="1"/>
+      <w:numFmt w:val="bullet"/>
+      <w:lvlText w:val="o"/>
+      <w:lvlJc w:val="left"/>
+      <w:pPr>
+        <w:ind w:left="5760" w:hanging="360"/>
+      </w:pPr>
+      <w:rPr>
+        <w:rFonts w:ascii="Courier New" w:hAnsi="Courier New" w:cs="Courier New" w:hint="default"/>
+      </w:rPr>
+    </w:lvl>
+    <w:lvl w:ilvl="8" w:tplc="04090005" w:tentative="1">
+      <w:start w:val="1"/>
+      <w:numFmt w:val="bullet"/>
+      <w:lvlText w:val=""/>
+      <w:lvlJc w:val="left"/>
+      <w:pPr>
+        <w:ind w:left="6480" w:hanging="360"/>
+      </w:pPr>
+      <w:rPr>
+        <w:rFonts w:ascii="Wingdings" w:hAnsi="Wingdings" w:hint="default"/>
+      </w:rPr>
+    </w:lvl>
+  </w:abstractNum>
+  <w:abstractNum w:abstractNumId="2" w15:restartNumberingAfterBreak="0">
     <w:nsid w:val="4CC912BF"/>
     <w:multiLevelType w:val="hybridMultilevel"/>
     <w:tmpl w:val="FFB8C99C"/>
@@ -2321,8 +3643,605 @@
       </w:rPr>
     </w:lvl>
   </w:abstractNum>
+  <w:abstractNum w:abstractNumId="3" w15:restartNumberingAfterBreak="0">
+    <w:nsid w:val="51FF6910"/>
+    <w:multiLevelType w:val="hybridMultilevel"/>
+    <w:tmpl w:val="0CF44420"/>
+    <w:lvl w:ilvl="0" w:tplc="4B4E42AC">
+      <w:start w:val="1"/>
+      <w:numFmt w:val="bullet"/>
+      <w:lvlText w:val=""/>
+      <w:lvlJc w:val="left"/>
+      <w:pPr>
+        <w:ind w:left="1440" w:hanging="360"/>
+      </w:pPr>
+      <w:rPr>
+        <w:rFonts w:ascii="Wingdings" w:eastAsiaTheme="minorHAnsi" w:hAnsi="Wingdings" w:cstheme="minorBidi" w:hint="default"/>
+      </w:rPr>
+    </w:lvl>
+    <w:lvl w:ilvl="1" w:tplc="04090003" w:tentative="1">
+      <w:start w:val="1"/>
+      <w:numFmt w:val="bullet"/>
+      <w:lvlText w:val="o"/>
+      <w:lvlJc w:val="left"/>
+      <w:pPr>
+        <w:ind w:left="2160" w:hanging="360"/>
+      </w:pPr>
+      <w:rPr>
+        <w:rFonts w:ascii="Courier New" w:hAnsi="Courier New" w:cs="Courier New" w:hint="default"/>
+      </w:rPr>
+    </w:lvl>
+    <w:lvl w:ilvl="2" w:tplc="04090005" w:tentative="1">
+      <w:start w:val="1"/>
+      <w:numFmt w:val="bullet"/>
+      <w:lvlText w:val=""/>
+      <w:lvlJc w:val="left"/>
+      <w:pPr>
+        <w:ind w:left="2880" w:hanging="360"/>
+      </w:pPr>
+      <w:rPr>
+        <w:rFonts w:ascii="Wingdings" w:hAnsi="Wingdings" w:hint="default"/>
+      </w:rPr>
+    </w:lvl>
+    <w:lvl w:ilvl="3" w:tplc="04090001" w:tentative="1">
+      <w:start w:val="1"/>
+      <w:numFmt w:val="bullet"/>
+      <w:lvlText w:val=""/>
+      <w:lvlJc w:val="left"/>
+      <w:pPr>
+        <w:ind w:left="3600" w:hanging="360"/>
+      </w:pPr>
+      <w:rPr>
+        <w:rFonts w:ascii="Symbol" w:hAnsi="Symbol" w:hint="default"/>
+      </w:rPr>
+    </w:lvl>
+    <w:lvl w:ilvl="4" w:tplc="04090003" w:tentative="1">
+      <w:start w:val="1"/>
+      <w:numFmt w:val="bullet"/>
+      <w:lvlText w:val="o"/>
+      <w:lvlJc w:val="left"/>
+      <w:pPr>
+        <w:ind w:left="4320" w:hanging="360"/>
+      </w:pPr>
+      <w:rPr>
+        <w:rFonts w:ascii="Courier New" w:hAnsi="Courier New" w:cs="Courier New" w:hint="default"/>
+      </w:rPr>
+    </w:lvl>
+    <w:lvl w:ilvl="5" w:tplc="04090005" w:tentative="1">
+      <w:start w:val="1"/>
+      <w:numFmt w:val="bullet"/>
+      <w:lvlText w:val=""/>
+      <w:lvlJc w:val="left"/>
+      <w:pPr>
+        <w:ind w:left="5040" w:hanging="360"/>
+      </w:pPr>
+      <w:rPr>
+        <w:rFonts w:ascii="Wingdings" w:hAnsi="Wingdings" w:hint="default"/>
+      </w:rPr>
+    </w:lvl>
+    <w:lvl w:ilvl="6" w:tplc="04090001" w:tentative="1">
+      <w:start w:val="1"/>
+      <w:numFmt w:val="bullet"/>
+      <w:lvlText w:val=""/>
+      <w:lvlJc w:val="left"/>
+      <w:pPr>
+        <w:ind w:left="5760" w:hanging="360"/>
+      </w:pPr>
+      <w:rPr>
+        <w:rFonts w:ascii="Symbol" w:hAnsi="Symbol" w:hint="default"/>
+      </w:rPr>
+    </w:lvl>
+    <w:lvl w:ilvl="7" w:tplc="04090003" w:tentative="1">
+      <w:start w:val="1"/>
+      <w:numFmt w:val="bullet"/>
+      <w:lvlText w:val="o"/>
+      <w:lvlJc w:val="left"/>
+      <w:pPr>
+        <w:ind w:left="6480" w:hanging="360"/>
+      </w:pPr>
+      <w:rPr>
+        <w:rFonts w:ascii="Courier New" w:hAnsi="Courier New" w:cs="Courier New" w:hint="default"/>
+      </w:rPr>
+    </w:lvl>
+    <w:lvl w:ilvl="8" w:tplc="04090005" w:tentative="1">
+      <w:start w:val="1"/>
+      <w:numFmt w:val="bullet"/>
+      <w:lvlText w:val=""/>
+      <w:lvlJc w:val="left"/>
+      <w:pPr>
+        <w:ind w:left="7200" w:hanging="360"/>
+      </w:pPr>
+      <w:rPr>
+        <w:rFonts w:ascii="Wingdings" w:hAnsi="Wingdings" w:hint="default"/>
+      </w:rPr>
+    </w:lvl>
+  </w:abstractNum>
+  <w:abstractNum w:abstractNumId="4" w15:restartNumberingAfterBreak="0">
+    <w:nsid w:val="557B07DA"/>
+    <w:multiLevelType w:val="hybridMultilevel"/>
+    <w:tmpl w:val="CD70E220"/>
+    <w:lvl w:ilvl="0" w:tplc="615C9580">
+      <w:start w:val="1"/>
+      <w:numFmt w:val="decimal"/>
+      <w:lvlText w:val="%1."/>
+      <w:lvlJc w:val="left"/>
+      <w:pPr>
+        <w:ind w:left="1080" w:hanging="360"/>
+      </w:pPr>
+      <w:rPr>
+        <w:rFonts w:hint="default"/>
+      </w:rPr>
+    </w:lvl>
+    <w:lvl w:ilvl="1" w:tplc="04090019" w:tentative="1">
+      <w:start w:val="1"/>
+      <w:numFmt w:val="lowerLetter"/>
+      <w:lvlText w:val="%2."/>
+      <w:lvlJc w:val="left"/>
+      <w:pPr>
+        <w:ind w:left="1800" w:hanging="360"/>
+      </w:pPr>
+    </w:lvl>
+    <w:lvl w:ilvl="2" w:tplc="0409001B" w:tentative="1">
+      <w:start w:val="1"/>
+      <w:numFmt w:val="lowerRoman"/>
+      <w:lvlText w:val="%3."/>
+      <w:lvlJc w:val="right"/>
+      <w:pPr>
+        <w:ind w:left="2520" w:hanging="180"/>
+      </w:pPr>
+    </w:lvl>
+    <w:lvl w:ilvl="3" w:tplc="0409000F" w:tentative="1">
+      <w:start w:val="1"/>
+      <w:numFmt w:val="decimal"/>
+      <w:lvlText w:val="%4."/>
+      <w:lvlJc w:val="left"/>
+      <w:pPr>
+        <w:ind w:left="3240" w:hanging="360"/>
+      </w:pPr>
+    </w:lvl>
+    <w:lvl w:ilvl="4" w:tplc="04090019" w:tentative="1">
+      <w:start w:val="1"/>
+      <w:numFmt w:val="lowerLetter"/>
+      <w:lvlText w:val="%5."/>
+      <w:lvlJc w:val="left"/>
+      <w:pPr>
+        <w:ind w:left="3960" w:hanging="360"/>
+      </w:pPr>
+    </w:lvl>
+    <w:lvl w:ilvl="5" w:tplc="0409001B" w:tentative="1">
+      <w:start w:val="1"/>
+      <w:numFmt w:val="lowerRoman"/>
+      <w:lvlText w:val="%6."/>
+      <w:lvlJc w:val="right"/>
+      <w:pPr>
+        <w:ind w:left="4680" w:hanging="180"/>
+      </w:pPr>
+    </w:lvl>
+    <w:lvl w:ilvl="6" w:tplc="0409000F" w:tentative="1">
+      <w:start w:val="1"/>
+      <w:numFmt w:val="decimal"/>
+      <w:lvlText w:val="%7."/>
+      <w:lvlJc w:val="left"/>
+      <w:pPr>
+        <w:ind w:left="5400" w:hanging="360"/>
+      </w:pPr>
+    </w:lvl>
+    <w:lvl w:ilvl="7" w:tplc="04090019" w:tentative="1">
+      <w:start w:val="1"/>
+      <w:numFmt w:val="lowerLetter"/>
+      <w:lvlText w:val="%8."/>
+      <w:lvlJc w:val="left"/>
+      <w:pPr>
+        <w:ind w:left="6120" w:hanging="360"/>
+      </w:pPr>
+    </w:lvl>
+    <w:lvl w:ilvl="8" w:tplc="0409001B" w:tentative="1">
+      <w:start w:val="1"/>
+      <w:numFmt w:val="lowerRoman"/>
+      <w:lvlText w:val="%9."/>
+      <w:lvlJc w:val="right"/>
+      <w:pPr>
+        <w:ind w:left="6840" w:hanging="180"/>
+      </w:pPr>
+    </w:lvl>
+  </w:abstractNum>
+  <w:abstractNum w:abstractNumId="5" w15:restartNumberingAfterBreak="0">
+    <w:nsid w:val="5B896C7B"/>
+    <w:multiLevelType w:val="multilevel"/>
+    <w:tmpl w:val="0AC8E22E"/>
+    <w:lvl w:ilvl="0">
+      <w:start w:val="1"/>
+      <w:numFmt w:val="bullet"/>
+      <w:lvlText w:val=""/>
+      <w:lvlJc w:val="left"/>
+      <w:pPr>
+        <w:tabs>
+          <w:tab w:val="num" w:pos="720"/>
+        </w:tabs>
+        <w:ind w:left="720" w:hanging="360"/>
+      </w:pPr>
+      <w:rPr>
+        <w:rFonts w:ascii="Symbol" w:hAnsi="Symbol" w:hint="default"/>
+        <w:sz w:val="20"/>
+      </w:rPr>
+    </w:lvl>
+    <w:lvl w:ilvl="1" w:tentative="1">
+      <w:start w:val="1"/>
+      <w:numFmt w:val="bullet"/>
+      <w:lvlText w:val="o"/>
+      <w:lvlJc w:val="left"/>
+      <w:pPr>
+        <w:tabs>
+          <w:tab w:val="num" w:pos="1440"/>
+        </w:tabs>
+        <w:ind w:left="1440" w:hanging="360"/>
+      </w:pPr>
+      <w:rPr>
+        <w:rFonts w:ascii="Courier New" w:hAnsi="Courier New" w:hint="default"/>
+        <w:sz w:val="20"/>
+      </w:rPr>
+    </w:lvl>
+    <w:lvl w:ilvl="2" w:tentative="1">
+      <w:start w:val="1"/>
+      <w:numFmt w:val="bullet"/>
+      <w:lvlText w:val=""/>
+      <w:lvlJc w:val="left"/>
+      <w:pPr>
+        <w:tabs>
+          <w:tab w:val="num" w:pos="2160"/>
+        </w:tabs>
+        <w:ind w:left="2160" w:hanging="360"/>
+      </w:pPr>
+      <w:rPr>
+        <w:rFonts w:ascii="Wingdings" w:hAnsi="Wingdings" w:hint="default"/>
+        <w:sz w:val="20"/>
+      </w:rPr>
+    </w:lvl>
+    <w:lvl w:ilvl="3" w:tentative="1">
+      <w:start w:val="1"/>
+      <w:numFmt w:val="bullet"/>
+      <w:lvlText w:val=""/>
+      <w:lvlJc w:val="left"/>
+      <w:pPr>
+        <w:tabs>
+          <w:tab w:val="num" w:pos="2880"/>
+        </w:tabs>
+        <w:ind w:left="2880" w:hanging="360"/>
+      </w:pPr>
+      <w:rPr>
+        <w:rFonts w:ascii="Wingdings" w:hAnsi="Wingdings" w:hint="default"/>
+        <w:sz w:val="20"/>
+      </w:rPr>
+    </w:lvl>
+    <w:lvl w:ilvl="4" w:tentative="1">
+      <w:start w:val="1"/>
+      <w:numFmt w:val="bullet"/>
+      <w:lvlText w:val=""/>
+      <w:lvlJc w:val="left"/>
+      <w:pPr>
+        <w:tabs>
+          <w:tab w:val="num" w:pos="3600"/>
+        </w:tabs>
+        <w:ind w:left="3600" w:hanging="360"/>
+      </w:pPr>
+      <w:rPr>
+        <w:rFonts w:ascii="Wingdings" w:hAnsi="Wingdings" w:hint="default"/>
+        <w:sz w:val="20"/>
+      </w:rPr>
+    </w:lvl>
+    <w:lvl w:ilvl="5" w:tentative="1">
+      <w:start w:val="1"/>
+      <w:numFmt w:val="bullet"/>
+      <w:lvlText w:val=""/>
+      <w:lvlJc w:val="left"/>
+      <w:pPr>
+        <w:tabs>
+          <w:tab w:val="num" w:pos="4320"/>
+        </w:tabs>
+        <w:ind w:left="4320" w:hanging="360"/>
+      </w:pPr>
+      <w:rPr>
+        <w:rFonts w:ascii="Wingdings" w:hAnsi="Wingdings" w:hint="default"/>
+        <w:sz w:val="20"/>
+      </w:rPr>
+    </w:lvl>
+    <w:lvl w:ilvl="6" w:tentative="1">
+      <w:start w:val="1"/>
+      <w:numFmt w:val="bullet"/>
+      <w:lvlText w:val=""/>
+      <w:lvlJc w:val="left"/>
+      <w:pPr>
+        <w:tabs>
+          <w:tab w:val="num" w:pos="5040"/>
+        </w:tabs>
+        <w:ind w:left="5040" w:hanging="360"/>
+      </w:pPr>
+      <w:rPr>
+        <w:rFonts w:ascii="Wingdings" w:hAnsi="Wingdings" w:hint="default"/>
+        <w:sz w:val="20"/>
+      </w:rPr>
+    </w:lvl>
+    <w:lvl w:ilvl="7" w:tentative="1">
+      <w:start w:val="1"/>
+      <w:numFmt w:val="bullet"/>
+      <w:lvlText w:val=""/>
+      <w:lvlJc w:val="left"/>
+      <w:pPr>
+        <w:tabs>
+          <w:tab w:val="num" w:pos="5760"/>
+        </w:tabs>
+        <w:ind w:left="5760" w:hanging="360"/>
+      </w:pPr>
+      <w:rPr>
+        <w:rFonts w:ascii="Wingdings" w:hAnsi="Wingdings" w:hint="default"/>
+        <w:sz w:val="20"/>
+      </w:rPr>
+    </w:lvl>
+    <w:lvl w:ilvl="8" w:tentative="1">
+      <w:start w:val="1"/>
+      <w:numFmt w:val="bullet"/>
+      <w:lvlText w:val=""/>
+      <w:lvlJc w:val="left"/>
+      <w:pPr>
+        <w:tabs>
+          <w:tab w:val="num" w:pos="6480"/>
+        </w:tabs>
+        <w:ind w:left="6480" w:hanging="360"/>
+      </w:pPr>
+      <w:rPr>
+        <w:rFonts w:ascii="Wingdings" w:hAnsi="Wingdings" w:hint="default"/>
+        <w:sz w:val="20"/>
+      </w:rPr>
+    </w:lvl>
+  </w:abstractNum>
+  <w:abstractNum w:abstractNumId="6" w15:restartNumberingAfterBreak="0">
+    <w:nsid w:val="60586A8C"/>
+    <w:multiLevelType w:val="hybridMultilevel"/>
+    <w:tmpl w:val="5C9C6376"/>
+    <w:lvl w:ilvl="0" w:tplc="04090001">
+      <w:start w:val="1"/>
+      <w:numFmt w:val="bullet"/>
+      <w:lvlText w:val=""/>
+      <w:lvlJc w:val="left"/>
+      <w:pPr>
+        <w:ind w:left="720" w:hanging="360"/>
+      </w:pPr>
+      <w:rPr>
+        <w:rFonts w:ascii="Symbol" w:hAnsi="Symbol" w:hint="default"/>
+      </w:rPr>
+    </w:lvl>
+    <w:lvl w:ilvl="1" w:tplc="04090003">
+      <w:start w:val="1"/>
+      <w:numFmt w:val="bullet"/>
+      <w:lvlText w:val="o"/>
+      <w:lvlJc w:val="left"/>
+      <w:pPr>
+        <w:ind w:left="1440" w:hanging="360"/>
+      </w:pPr>
+      <w:rPr>
+        <w:rFonts w:ascii="Courier New" w:hAnsi="Courier New" w:cs="Courier New" w:hint="default"/>
+      </w:rPr>
+    </w:lvl>
+    <w:lvl w:ilvl="2" w:tplc="276496D2">
+      <w:numFmt w:val="bullet"/>
+      <w:lvlText w:val="-"/>
+      <w:lvlJc w:val="left"/>
+      <w:pPr>
+        <w:ind w:left="2160" w:hanging="360"/>
+      </w:pPr>
+      <w:rPr>
+        <w:rFonts w:ascii="Aptos" w:eastAsiaTheme="minorHAnsi" w:hAnsi="Aptos" w:cstheme="minorBidi" w:hint="default"/>
+      </w:rPr>
+    </w:lvl>
+    <w:lvl w:ilvl="3" w:tplc="04090001" w:tentative="1">
+      <w:start w:val="1"/>
+      <w:numFmt w:val="bullet"/>
+      <w:lvlText w:val=""/>
+      <w:lvlJc w:val="left"/>
+      <w:pPr>
+        <w:ind w:left="2880" w:hanging="360"/>
+      </w:pPr>
+      <w:rPr>
+        <w:rFonts w:ascii="Symbol" w:hAnsi="Symbol" w:hint="default"/>
+      </w:rPr>
+    </w:lvl>
+    <w:lvl w:ilvl="4" w:tplc="04090003" w:tentative="1">
+      <w:start w:val="1"/>
+      <w:numFmt w:val="bullet"/>
+      <w:lvlText w:val="o"/>
+      <w:lvlJc w:val="left"/>
+      <w:pPr>
+        <w:ind w:left="3600" w:hanging="360"/>
+      </w:pPr>
+      <w:rPr>
+        <w:rFonts w:ascii="Courier New" w:hAnsi="Courier New" w:cs="Courier New" w:hint="default"/>
+      </w:rPr>
+    </w:lvl>
+    <w:lvl w:ilvl="5" w:tplc="04090005" w:tentative="1">
+      <w:start w:val="1"/>
+      <w:numFmt w:val="bullet"/>
+      <w:lvlText w:val=""/>
+      <w:lvlJc w:val="left"/>
+      <w:pPr>
+        <w:ind w:left="4320" w:hanging="360"/>
+      </w:pPr>
+      <w:rPr>
+        <w:rFonts w:ascii="Wingdings" w:hAnsi="Wingdings" w:hint="default"/>
+      </w:rPr>
+    </w:lvl>
+    <w:lvl w:ilvl="6" w:tplc="04090001" w:tentative="1">
+      <w:start w:val="1"/>
+      <w:numFmt w:val="bullet"/>
+      <w:lvlText w:val=""/>
+      <w:lvlJc w:val="left"/>
+      <w:pPr>
+        <w:ind w:left="5040" w:hanging="360"/>
+      </w:pPr>
+      <w:rPr>
+        <w:rFonts w:ascii="Symbol" w:hAnsi="Symbol" w:hint="default"/>
+      </w:rPr>
+    </w:lvl>
+    <w:lvl w:ilvl="7" w:tplc="04090003" w:tentative="1">
+      <w:start w:val="1"/>
+      <w:numFmt w:val="bullet"/>
+      <w:lvlText w:val="o"/>
+      <w:lvlJc w:val="left"/>
+      <w:pPr>
+        <w:ind w:left="5760" w:hanging="360"/>
+      </w:pPr>
+      <w:rPr>
+        <w:rFonts w:ascii="Courier New" w:hAnsi="Courier New" w:cs="Courier New" w:hint="default"/>
+      </w:rPr>
+    </w:lvl>
+    <w:lvl w:ilvl="8" w:tplc="04090005" w:tentative="1">
+      <w:start w:val="1"/>
+      <w:numFmt w:val="bullet"/>
+      <w:lvlText w:val=""/>
+      <w:lvlJc w:val="left"/>
+      <w:pPr>
+        <w:ind w:left="6480" w:hanging="360"/>
+      </w:pPr>
+      <w:rPr>
+        <w:rFonts w:ascii="Wingdings" w:hAnsi="Wingdings" w:hint="default"/>
+      </w:rPr>
+    </w:lvl>
+  </w:abstractNum>
+  <w:abstractNum w:abstractNumId="7" w15:restartNumberingAfterBreak="0">
+    <w:nsid w:val="6F6962A1"/>
+    <w:multiLevelType w:val="hybridMultilevel"/>
+    <w:tmpl w:val="E9424618"/>
+    <w:lvl w:ilvl="0" w:tplc="04090001">
+      <w:start w:val="1"/>
+      <w:numFmt w:val="bullet"/>
+      <w:lvlText w:val=""/>
+      <w:lvlJc w:val="left"/>
+      <w:pPr>
+        <w:ind w:left="720" w:hanging="360"/>
+      </w:pPr>
+      <w:rPr>
+        <w:rFonts w:ascii="Symbol" w:hAnsi="Symbol" w:hint="default"/>
+      </w:rPr>
+    </w:lvl>
+    <w:lvl w:ilvl="1" w:tplc="04090003">
+      <w:start w:val="1"/>
+      <w:numFmt w:val="bullet"/>
+      <w:lvlText w:val="o"/>
+      <w:lvlJc w:val="left"/>
+      <w:pPr>
+        <w:ind w:left="1440" w:hanging="360"/>
+      </w:pPr>
+      <w:rPr>
+        <w:rFonts w:ascii="Courier New" w:hAnsi="Courier New" w:cs="Courier New" w:hint="default"/>
+      </w:rPr>
+    </w:lvl>
+    <w:lvl w:ilvl="2" w:tplc="04090005">
+      <w:start w:val="1"/>
+      <w:numFmt w:val="bullet"/>
+      <w:lvlText w:val=""/>
+      <w:lvlJc w:val="left"/>
+      <w:pPr>
+        <w:ind w:left="2160" w:hanging="360"/>
+      </w:pPr>
+      <w:rPr>
+        <w:rFonts w:ascii="Wingdings" w:hAnsi="Wingdings" w:hint="default"/>
+      </w:rPr>
+    </w:lvl>
+    <w:lvl w:ilvl="3" w:tplc="04090001" w:tentative="1">
+      <w:start w:val="1"/>
+      <w:numFmt w:val="bullet"/>
+      <w:lvlText w:val=""/>
+      <w:lvlJc w:val="left"/>
+      <w:pPr>
+        <w:ind w:left="2880" w:hanging="360"/>
+      </w:pPr>
+      <w:rPr>
+        <w:rFonts w:ascii="Symbol" w:hAnsi="Symbol" w:hint="default"/>
+      </w:rPr>
+    </w:lvl>
+    <w:lvl w:ilvl="4" w:tplc="04090003" w:tentative="1">
+      <w:start w:val="1"/>
+      <w:numFmt w:val="bullet"/>
+      <w:lvlText w:val="o"/>
+      <w:lvlJc w:val="left"/>
+      <w:pPr>
+        <w:ind w:left="3600" w:hanging="360"/>
+      </w:pPr>
+      <w:rPr>
+        <w:rFonts w:ascii="Courier New" w:hAnsi="Courier New" w:cs="Courier New" w:hint="default"/>
+      </w:rPr>
+    </w:lvl>
+    <w:lvl w:ilvl="5" w:tplc="04090005" w:tentative="1">
+      <w:start w:val="1"/>
+      <w:numFmt w:val="bullet"/>
+      <w:lvlText w:val=""/>
+      <w:lvlJc w:val="left"/>
+      <w:pPr>
+        <w:ind w:left="4320" w:hanging="360"/>
+      </w:pPr>
+      <w:rPr>
+        <w:rFonts w:ascii="Wingdings" w:hAnsi="Wingdings" w:hint="default"/>
+      </w:rPr>
+    </w:lvl>
+    <w:lvl w:ilvl="6" w:tplc="04090001" w:tentative="1">
+      <w:start w:val="1"/>
+      <w:numFmt w:val="bullet"/>
+      <w:lvlText w:val=""/>
+      <w:lvlJc w:val="left"/>
+      <w:pPr>
+        <w:ind w:left="5040" w:hanging="360"/>
+      </w:pPr>
+      <w:rPr>
+        <w:rFonts w:ascii="Symbol" w:hAnsi="Symbol" w:hint="default"/>
+      </w:rPr>
+    </w:lvl>
+    <w:lvl w:ilvl="7" w:tplc="04090003" w:tentative="1">
+      <w:start w:val="1"/>
+      <w:numFmt w:val="bullet"/>
+      <w:lvlText w:val="o"/>
+      <w:lvlJc w:val="left"/>
+      <w:pPr>
+        <w:ind w:left="5760" w:hanging="360"/>
+      </w:pPr>
+      <w:rPr>
+        <w:rFonts w:ascii="Courier New" w:hAnsi="Courier New" w:cs="Courier New" w:hint="default"/>
+      </w:rPr>
+    </w:lvl>
+    <w:lvl w:ilvl="8" w:tplc="04090005" w:tentative="1">
+      <w:start w:val="1"/>
+      <w:numFmt w:val="bullet"/>
+      <w:lvlText w:val=""/>
+      <w:lvlJc w:val="left"/>
+      <w:pPr>
+        <w:ind w:left="6480" w:hanging="360"/>
+      </w:pPr>
+      <w:rPr>
+        <w:rFonts w:ascii="Wingdings" w:hAnsi="Wingdings" w:hint="default"/>
+      </w:rPr>
+    </w:lvl>
+  </w:abstractNum>
   <w:num w:numId="1" w16cid:durableId="1181161176">
+    <w:abstractNumId w:val="2"/>
+  </w:num>
+  <w:num w:numId="2" w16cid:durableId="602805106">
+    <w:abstractNumId w:val="4"/>
+  </w:num>
+  <w:num w:numId="3" w16cid:durableId="268394366">
+    <w:abstractNumId w:val="3"/>
+  </w:num>
+  <w:num w:numId="4" w16cid:durableId="1586065963">
+    <w:abstractNumId w:val="5"/>
+  </w:num>
+  <w:num w:numId="5" w16cid:durableId="1461264972">
     <w:abstractNumId w:val="0"/>
+  </w:num>
+  <w:num w:numId="6" w16cid:durableId="1814759019">
+    <w:abstractNumId w:val="6"/>
+  </w:num>
+  <w:num w:numId="7" w16cid:durableId="1459450907">
+    <w:abstractNumId w:val="7"/>
+  </w:num>
+  <w:num w:numId="8" w16cid:durableId="1494957231">
+    <w:abstractNumId w:val="1"/>
   </w:num>
 </w:numbering>
 </file>

</xml_diff>